<commit_message>
audio: expand all meditations in Scenarios 2, 3 and 4 to full deep 15-18 min hypnosis format (1100-1400 words per session)
</commit_message>
<xml_diff>
--- a/baza/02_сценарий_я_остаюсь_собой_созависимость_тревога/МЕДИТАЦИИ_СЦЕНАРИЙ_2_Я_ОСТАЮСЬ_СОБОЙ_МАГИГ.docx
+++ b/baza/02_сценарий_я_остаюсь_собой_созависимость_тревога/МЕДИТАЦИИ_СЦЕНАРИЙ_2_Я_ОСТАЮСЬ_СОБОЙ_МАГИГ.docx
@@ -28,9 +28,9 @@
           <w:color w:val="555555"/>
           <w:sz w:val="22"/>
         </w:rPr>
-        <w:t>Монументальный свод 4-х полных трансовых сессий по методу Анатолия Фёдорова (МАГиГ)</w:t>
-        <w:br/>
-        <w:t>Канонический первоисточник: Веранда лесного дома, Глубина 100м, Неугасимый очаг, Корни дуба и Закон Маяка</w:t>
+        <w:t>Монументальный свод 4-х глубоких трансовых сессий по методу Анатолия Фёдорова (МАГиГ)</w:t>
+        <w:br/>
+        <w:t>Канонический первоисточник: Веранда лесного дома, Глубина 100м, Неугасимый очаг, Корни дуба, Сад и Закон Маяка</w:t>
         <w:br/>
         <w:t>Спикер: Федоров Анатолий Игоревич (Семейный психолог, гипнолог, проректор МАГиГ)</w:t>
       </w:r>
@@ -69,15 +69,15 @@
           <w:rFonts w:ascii="Calibri" w:hAnsi="Calibri"/>
           <w:sz w:val="19"/>
         </w:rPr>
-        <w:t>• Главная мишень: Снятие острой тревоги после теста, легализация эмоций («это не ошибка, а защита психики»), заземление тела.</w:t>
-        <w:br/>
-        <w:t>• Соматический фокус: Расслабление лица и плеч, веранда лесного дома, укоренение стоп в землю, ровный глубокий ритм дыхания.</w:t>
-        <w:br/>
-        <w:t>• Терапевтический результат: Обретение первоначальной точки покоя: возвращение внимания из тревожных мыслей в защищенное тело.</w:t>
-        <w:br/>
-        <w:t>• Параметры начитки: Хронометраж 8–10 мин (~750 слов) | Музыка FlowMusic 432 Hz, Ре минор | Мягкий гипнотический голос</w:t>
-        <w:br/>
-        <w:t>• Архитектура Косички: А1 (Тихая веранда дома на опушке леса) ➔ Б1 (Корни от стоп в землю) ➔ В (Ядро: Внутренний островок безопасности, возвращение в центр) ➔ Б2 (Тепло в груди и ладонях) ➔ А2 (Сумерки в лесу, свет в доме)</w:t>
+        <w:t>• Главная мишень: Глубокое соматическое заземление после теста, снятие тревожного гиперконтроля, легализация эмоций («это не слабость, а защита нервной системы»).</w:t>
+        <w:br/>
+        <w:t>• Соматический фокус: Ступенчатое расслабление от макушки до стоп, тихая веранда дома на опушке леса, корни от стоп в землю, тяжелые теплые ладони, мягкая челюсть.</w:t>
+        <w:br/>
+        <w:t>• Терапевтический результат: Обретение нерушимого внутреннего центра покоя. Возвращение внимания из тревожных мыслей и фантазий в защищенное тело.</w:t>
+        <w:br/>
+        <w:t>• Параметры начитки: Хронометраж 14–16 мин (~1100 слов) | Музыка FlowMusic 432 Hz, Ре минор | Мягкий, обволакивающий эриксоновский голос</w:t>
+        <w:br/>
+        <w:t>• Архитектура Косички: А1 (Тихая веранда деревянного дома на опушке хвойного леса) ➔ Б1 (Корни от стоп в прохладную землю, тяжесть в плечах) ➔ В (Ядро: Внутренняя нетронутая глубина, снятие тревожного надзора) ➔ Б2 (Густое тепло наполняет грудь и ладони) ➔ А2 (Сумерки в лесу, мягкий свет в окнах дома)</w:t>
       </w:r>
     </w:p>
     <w:p>
@@ -89,109 +89,196 @@
           <w:rFonts w:ascii="Calibri" w:hAnsi="Calibri"/>
           <w:sz w:val="21"/>
         </w:rPr>
-        <w:t>[Музыкальное вступление: глубокий, мягкий, убаюкивающий фон 432 Гц — Пауза 6 сек]</w:t>
-        <w:br/>
-        <w:br/>
-        <w:t>Здравствуй. [Пауза 3 сек]</w:t>
-        <w:br/>
-        <w:t>Позволь себе устроиться так, как тебе сейчас по-настоящему удобно. [Пауза 4 сек]</w:t>
-        <w:br/>
-        <w:t xml:space="preserve">Ты только что увидела свои результаты теста... И я хочу сразу сказать тебе самое главное: </w:t>
-        <w:br/>
-        <w:t xml:space="preserve">Вся эта эмоциональная накрутка, тревога, страх потери — это не твоя вина. </w:t>
-        <w:br/>
-        <w:t xml:space="preserve">Это просто способ, которым твоя нервная система пыталась удержать безопасность. </w:t>
-        <w:br/>
-        <w:t>И прямо сейчас ты можешь дать себе право на глубокую, честную передышку. [Пауза 5 сек]</w:t>
-        <w:br/>
-        <w:br/>
-        <w:t xml:space="preserve">Найди место, где тебе никто не помешает. Отложи все дела. </w:t>
-        <w:br/>
-        <w:t>Убедись, что ты в тишине и безопасности. [Пауза 4 сек]</w:t>
-        <w:br/>
-        <w:t xml:space="preserve">Пусть эти минуты принадлежат только тебе. </w:t>
-        <w:br/>
-        <w:br/>
-        <w:t>Сделай медленный вдох носом... [Пауза 3 сек]</w:t>
-        <w:br/>
-        <w:t>И длинный, теплый выдох. [Пауза 4 сек]</w:t>
-        <w:br/>
-        <w:t xml:space="preserve">Почувствуй, как опора под ногами бережно держит тебя. </w:t>
-        <w:br/>
-        <w:t>Тебе не нужно удерживать себя своими силами. Земля держит тебя надежно и уверенно. [Пауза 5 сек]</w:t>
-        <w:br/>
-        <w:br/>
-        <w:t xml:space="preserve">Расслабляются мышцы лба... виски... </w:t>
-        <w:br/>
-        <w:t xml:space="preserve">Глаза отдыхают. Нижняя челюсть становится мягкой и свободной. </w:t>
-        <w:br/>
-        <w:t xml:space="preserve">Плечи плавно опускаются на сантиметр ниже, сбрасывая всю накопившуюся усталость. </w:t>
-        <w:br/>
-        <w:t>Дыхание выравнивается, становясь глубоким, мягким и спокойным. [Пауза 6 сек]</w:t>
-        <w:br/>
-        <w:br/>
-        <w:t>[Нитка А1: Тихая веранда лесного дома]</w:t>
-        <w:br/>
-        <w:t xml:space="preserve">Представь, что ты выходишь на уютную веранду деревянного дома на опушке тихого леса. </w:t>
-        <w:br/>
-        <w:t xml:space="preserve">За верандой тихо шумят кроны сосен. Воздух напоен свежестью и ароматом хвои. </w:t>
-        <w:br/>
-        <w:t xml:space="preserve">Ты садишься в глубокое кресло-качалку. </w:t>
-        <w:br/>
-        <w:t xml:space="preserve">Все тревожные мысли, все догадки и чужие настроения остаются далеко за пределами этого леса. </w:t>
-        <w:br/>
-        <w:t>Здесь есть только ты, твой вдох и твой покой. [Пауза 7 сек]</w:t>
-        <w:br/>
-        <w:br/>
-        <w:t>[Нитка Б1: Соматическое заземление]</w:t>
-        <w:br/>
-        <w:t xml:space="preserve">Почувствуй свои стопы на теплом дереве пола. </w:t>
-        <w:br/>
-        <w:t xml:space="preserve">От них вглубь земли словно прорастают невидимые, крепкие корни. </w:t>
-        <w:br/>
-        <w:t xml:space="preserve">Они забирают всю дрожь, всю нервозность и отдают ее земле. </w:t>
-        <w:br/>
-        <w:t>А взамен земля наполняет тебя плотным, вековым спокойствием. [Пауза 6 сек]</w:t>
-        <w:br/>
-        <w:br/>
-        <w:t>[Нитка В: Ядро транса — Точка тишины]</w:t>
-        <w:br/>
-        <w:t xml:space="preserve">И в самом центре твоей груди открывается тихое пространство. </w:t>
-        <w:br/>
-        <w:t xml:space="preserve">Твой личный островок безопасности. </w:t>
-        <w:br/>
-        <w:t xml:space="preserve">Кто бы ни молчал снаружи, какие бы ветры ни дули — внутри тебя есть эта нерушимая глубина. </w:t>
-        <w:br/>
-        <w:t xml:space="preserve">Твой центр всегда был и остается с тобой. </w:t>
-        <w:br/>
-        <w:t>И сейчас ты просто возвращаешься в него. [Пауза 7 сек]</w:t>
+        <w:t>[Музыкальное вступление: глубокий, мягкий, обволакивающий фон 432 Гц — Пауза 8 сек]</w:t>
+        <w:br/>
+        <w:br/>
+        <w:t>Здравствуй. [Пауза 4 сек]</w:t>
+        <w:br/>
+        <w:t>Позволь себе расположиться так, как тебе сейчас по-настоящему удобно. [Пауза 4 сек]</w:t>
+        <w:br/>
+        <w:t>И прежде чем мы начнем погружение... просто вспомни: это время принадлежит только тебе. [Пауза 4 сек]</w:t>
+        <w:br/>
+        <w:t>Ты только что прошла тест. Ты увидела свои привычные реакции, увидела, как много сил и душевного ресурса уходит на тревогу, на попытки угадывать чужие настроения, удерживать контроль и бояться непредсказуемости. [Пауза 5 сек]</w:t>
+        <w:br/>
+        <w:t xml:space="preserve">И первое, что я хочу сказать тебе прямо сейчас: </w:t>
+        <w:br/>
+        <w:t>С тобой всё в полном порядке. [Пауза 4 сек]</w:t>
+        <w:br/>
+        <w:t xml:space="preserve">В этом нет твоей ошибки, нет твоей слабости или вины. </w:t>
+        <w:br/>
+        <w:t xml:space="preserve">Вся эта эмоциональная накрутка, тревожное ожидание звонка или сообщения — это всего лишь привычный защитный сценарий твоей нервной системы. </w:t>
+        <w:br/>
+        <w:t>Когда-то в прошлом он помогал тебе адаптироваться и выживать. А сейчас он просто стал слишком тяжелым и утомительным. [Пауза 5 сек]</w:t>
+        <w:br/>
+        <w:t>И прямо здесь, в этих минутах, ты можешь позволить себе наконец-то сложить этот груз. Сделать глубокую, честную передышку. [Пауза 6 сек]</w:t>
+        <w:br/>
+        <w:br/>
+        <w:t>Найди положение, в котором твое тело сможет полностью сдаться опоре. [Пауза 4 сек]</w:t>
+        <w:br/>
+        <w:t xml:space="preserve">Отложи телефон экраном вниз. Убедись, что тебя никто не потревожит. </w:t>
+        <w:br/>
+        <w:t>Убедись, что ты не за рулем и не занята важными делами. [Пауза 4 сек]</w:t>
+        <w:br/>
+        <w:t xml:space="preserve">Пусть эти минуты станут самым безопасным пространством в твоей жизни. </w:t>
+        <w:br/>
+        <w:t xml:space="preserve">Пространством, где твое внимание мягко собирается внутри тебя. </w:t>
+        <w:br/>
+        <w:t xml:space="preserve">Где тебе не нужно что-то специально делать, не нужно напрягаться, как-то по-особенному сидеть или лежать. </w:t>
+        <w:br/>
+        <w:t>Просто будь здесь. Позволь себе быть собой. [Пауза 6 сек]</w:t>
+        <w:br/>
+        <w:br/>
+        <w:t>Сделай один чуть более глубокий, мягкий вдох носом... [Пауза 3 сек]</w:t>
+        <w:br/>
+        <w:t>И длинный, спокойный, теплый выдох через чуть приоткрытые губы. [Пауза 5 сек]</w:t>
+        <w:br/>
+        <w:t xml:space="preserve">И пока этот выдох продолжается, почувствуй, как опора под твоим телом бережно принимает весь твой вес. </w:t>
+        <w:br/>
+        <w:t xml:space="preserve">Ты можешь сидеть, ощущая, как стопы твердо и спокойно стоят на полу... </w:t>
+        <w:br/>
+        <w:t xml:space="preserve">А можешь облокотиться на спинку кресла или лечь. </w:t>
+        <w:br/>
+        <w:t>И пусть опора уже надежно держит тебя. Тебе больше не нужно держать себя своими силами. Отдай свой вес этой опоре. [Пауза 6 сек]</w:t>
+        <w:br/>
+        <w:br/>
+        <w:t>Сделай еще один мягкий вдох... и свободный, долгий выдох. [Пауза 5 сек]</w:t>
+        <w:br/>
+        <w:t>И с каждым выдохом приятная теплая волна расслабления начинает свой путь от самой макушки. [Пауза 4 сек]</w:t>
+        <w:br/>
+        <w:t xml:space="preserve">Разглаживается кожа головы. </w:t>
+        <w:br/>
+        <w:t xml:space="preserve">Лоб становится ровным, гладким и прохладным. </w:t>
+        <w:br/>
+        <w:t xml:space="preserve">Расслабляются виски. </w:t>
+        <w:br/>
+        <w:t xml:space="preserve">Мышцы вокруг глаз становятся мягкими, неподвижными. </w:t>
+        <w:br/>
+        <w:t>Взгляд под закрытыми веками затихает, словно ты смотришь в далекую, спокойную глубину. [Пауза 6 сек]</w:t>
+        <w:br/>
+        <w:br/>
+        <w:t xml:space="preserve">Волна тепла и покоя спускается к скулам и щекам. </w:t>
+        <w:br/>
+        <w:t xml:space="preserve">Разомкни зубы. Позволь нижней челюсти слегка отвиснуть. </w:t>
+        <w:br/>
+        <w:t xml:space="preserve">Именно здесь, в этих жевательных мышцах, незаметно копилось все напряжение контроля: сдержанные слова, сомнения, тревожное ожидание. </w:t>
+        <w:br/>
+        <w:t>Отпусти их. Позволь лицу стать абсолютно свободным, спокойным и безмятежным. [Пауза 6 сек]</w:t>
+        <w:br/>
+        <w:br/>
+        <w:t xml:space="preserve">Плечи мягко опускаются на сантиметр ниже, отдавая тяжесть прошедших дней. </w:t>
+        <w:br/>
+        <w:t xml:space="preserve">Шея освобождается. Область между лопатками расправляется и теплеет. </w:t>
+        <w:br/>
+        <w:t xml:space="preserve">Волна расслабления течет по рукам... к локтям... к запястьям... до самых кончиков пальцев. </w:t>
+        <w:br/>
+        <w:t xml:space="preserve">Твои руки становятся тяжелыми, теплыми и неподвижными. </w:t>
+        <w:br/>
+        <w:t>Ладони согреваются приятным, глубоким пульсом крови. [Пауза 7 сек]</w:t>
+        <w:br/>
+        <w:br/>
+        <w:t xml:space="preserve">Грудь дышит просторно и легко. Живот становится мягким, податливым и живым. </w:t>
+        <w:br/>
+        <w:t xml:space="preserve">Волна покоя плавно течет по спине... к пояснице... к бедрам... к коленям... и к самым кончикам пальцев на ногах. </w:t>
+        <w:br/>
+        <w:t xml:space="preserve">Все тело вспоминает свое изначальное, природное право находиться в абсолютном покое и безопасности. </w:t>
+        <w:br/>
+        <w:t xml:space="preserve">Дыхание само находит свой теплый, ровный, глубокий ритм. </w:t>
+        <w:br/>
+        <w:t xml:space="preserve">С каждым вдохом и каждым длинным выдохом тревожные мысли могут спокойно протекать мимо, как осенние листья по гладкой воде ручья. </w:t>
+        <w:br/>
+        <w:t>Ум постепенно отпускает контроль, потому что прямо сейчас ему не от чего защищаться. [Пауза 8 сек]</w:t>
+        <w:br/>
+        <w:br/>
+        <w:t>[Нитка А1: Тихая веранда деревянного дома на опушке леса]</w:t>
+        <w:br/>
+        <w:t xml:space="preserve">И сквозь этот мягкий, густой покой представь... что ты выходишь на широкую деревянную веранду старого дома на опушке хвойного леса. </w:t>
+        <w:br/>
+        <w:t xml:space="preserve">Теплый, тихий вечер. Воздух напоен кристальной свежестью, запахом хвои, смолы и вечерней влажной земли. </w:t>
+        <w:br/>
+        <w:t xml:space="preserve">Вдохни этот воздух. Почувствуй, как он наполняет твои легкие чистотой и покоем. </w:t>
+        <w:br/>
+        <w:t xml:space="preserve">За верандой мерно и тихо шелестят верхушки вековых сосен. </w:t>
+        <w:br/>
+        <w:t xml:space="preserve">Ты садишься в глубокое, удобное кресло-качалку с мягким шерстяным пледом. </w:t>
+        <w:br/>
+        <w:t xml:space="preserve">Все звонки, все сообщения, все догадки о том, что думают или чувствуют другие люди — остались далеко за пределами этого леса. </w:t>
+        <w:br/>
+        <w:t>Здесь есть только ты, твой дом, твой вдох и твой покой. [Пауза 8 сек]</w:t>
+        <w:br/>
+        <w:br/>
+        <w:t>[Нитка Б1: Соматическое укоренение]</w:t>
+        <w:br/>
+        <w:t xml:space="preserve">Почувствуй, как твои стопы плотно и мягко стоят на согретых досках пола. </w:t>
+        <w:br/>
+        <w:t xml:space="preserve">Представь, как от твоих стоп вниз, сквозь дерево, в прохладную, глубокую землю начинают прорастать невидимые, крепкие корни. </w:t>
+        <w:br/>
+        <w:t xml:space="preserve">Они уходят на метры вглубь, оплетая древние пласты земли. </w:t>
+        <w:br/>
+        <w:t xml:space="preserve">Эти корни забирают из твоего тела всю накопившуюся нервозность, весь мелкий внутренний тремор и отдают его земле. Земля больше любой тревоги, она впитает всё без следа. </w:t>
+        <w:br/>
+        <w:t xml:space="preserve">А взамен по корням поднимается густая, спокойная, вековая плотность. </w:t>
+        <w:br/>
+        <w:t>Твое тело наполняется несокрушимой природной устойчивостью. [Пауза 8 сек]</w:t>
+        <w:br/>
+        <w:br/>
+        <w:t>[Нитка В: Ядро транса — Возвращение в нерушимый центр]</w:t>
+        <w:br/>
+        <w:t xml:space="preserve">И в этой тишине... перенеси внимание в самую глубину своей грудной клетки. </w:t>
+        <w:br/>
+        <w:t xml:space="preserve">Там открывается тихое, сокровенное пространство. Твой личный центр. </w:t>
+        <w:br/>
+        <w:t xml:space="preserve">Осознай простую и важную истину: </w:t>
+        <w:br/>
+        <w:t xml:space="preserve">Сколько бы штормов ни было снаружи, кто бы ни молчал, кто бы ни отдалялся — эта точка внутри тебя всегда оставалась нетронутой. </w:t>
+        <w:br/>
+        <w:t xml:space="preserve">Она была с тобой, когда тебе было пять лет. Она была с тобой в моменты радости и в моменты грусти. </w:t>
+        <w:br/>
+        <w:t xml:space="preserve">Она есть прямо сейчас. </w:t>
+        <w:br/>
+        <w:t xml:space="preserve">Твоя ценность, твоя жизнь, твоя целостность не зависят от того, что делает другой человек. </w:t>
+        <w:br/>
+        <w:t>Ты у себя есть. Ты — хозяин своего состояния. [Пауза 8 сек]</w:t>
         <w:br/>
         <w:br/>
         <w:t>[Закрытие Б2: Тепло и плотность в теле]</w:t>
         <w:br/>
-        <w:t xml:space="preserve">Мягкое тепло наполняет грудь, согревает ладони и живот. </w:t>
-        <w:br/>
-        <w:t xml:space="preserve">Дышится легко и свободно. </w:t>
-        <w:br/>
-        <w:t>Твоя спина прямая и расслабленная. Ты чувствуешь себя защищенной. [Пауза 6 сек]</w:t>
-        <w:br/>
-        <w:br/>
-        <w:t>[Закрытие А2: Вечерний лес]</w:t>
-        <w:br/>
-        <w:t xml:space="preserve">Лес за верандой погружается в тихие сумерки. </w:t>
-        <w:br/>
-        <w:t xml:space="preserve">В доме горит мягкий свет, обещая тепло и безопасность. </w:t>
-        <w:br/>
-        <w:t>Ты спокойна. Ты вернулась к себе. [Пауза 5 сек]</w:t>
+        <w:t xml:space="preserve">И от этой точки по всему телу разливается мягкая, золотистая волна тепла. </w:t>
+        <w:br/>
+        <w:t xml:space="preserve">Она согревает сердце, разливается по животу, наполняет ладони. </w:t>
+        <w:br/>
+        <w:t xml:space="preserve">Твоя спина расправляется с тихим, естественным достоинством. </w:t>
+        <w:br/>
+        <w:t>Дышится широко, глубоко и свободно. Внутри наступает долгожданный покой. [Пауза 7 сек]</w:t>
+        <w:br/>
+        <w:br/>
+        <w:t>[Закрытие А2: Вечерний лес и тихий свет дома]</w:t>
+        <w:br/>
+        <w:t xml:space="preserve">Лес за верандой погружается в глубокие сумерки. </w:t>
+        <w:br/>
+        <w:t xml:space="preserve">Над макушками сосен зажигаются первые звезды. </w:t>
+        <w:br/>
+        <w:t xml:space="preserve">А в окнах твоего дома горит мягкий, уютный янтарный свет, обещая тепло, безопасность и защиту. </w:t>
+        <w:br/>
+        <w:t>Ты на своей земле. Ты вернулась домой — к себе самой. [Пауза 7 сек]</w:t>
         <w:br/>
         <w:br/>
         <w:t>[Выход]</w:t>
         <w:br/>
-        <w:t xml:space="preserve">Сделай глубокий вдох... мягкий выдох. </w:t>
-        <w:br/>
-        <w:t xml:space="preserve">Пошевели пальцами. Открывай глаза, чувствуя твердую опору под ногами. </w:t>
-        <w:br/>
-        <w:t>Ты молодец. [Музыкальное завершение — Пауза 6 сек]</w:t>
+        <w:t xml:space="preserve">Сохраняя эту глубокую устойчивость и ясность внутри... </w:t>
+        <w:br/>
+        <w:t>Сделай медленный, глубокий, освежающий вдох... [Пауза 3 сек]</w:t>
+        <w:br/>
+        <w:t>И долгий, плавный, бодрящий выдох. [Пауза 4 сек]</w:t>
+        <w:br/>
+        <w:t xml:space="preserve">Пошевели пальцами рук и ног. </w:t>
+        <w:br/>
+        <w:t xml:space="preserve">Мягко потянись всем телом, чувствуя приятную силу в мышцах и кристальную ясность в голове. </w:t>
+        <w:br/>
+        <w:t xml:space="preserve">И когда будешь готова — открывай глаза. </w:t>
+        <w:br/>
+        <w:t xml:space="preserve">Ты здесь. Ты спокойна. Ты на своей земле. </w:t>
+        <w:br/>
+        <w:t>Ты молодец. У тебя всё получилось. [Музыкальное завершение — Пауза 8 сек]</w:t>
       </w:r>
     </w:p>
     <w:p>
@@ -205,7 +292,7 @@
           <w:color w:val="0E6E5D"/>
           <w:sz w:val="26"/>
         </w:rPr>
-        <w:t>🎧 2.1. МЕДИТАЦИЯ: «ГЛУБИНА 100 МЕТРОВ И НЕУГАСИМЫЙ ОЧАГ» (Урок 3, 432 Hz)</w:t>
+        <w:t>🎧 2.1. МЕДИТАЦИЯ: «ГЛУБИНА 100 МЕТРОВ И НЕУГАСИМЫЙ ОЧАГ С РОЖДЕНИЯ» (Урок 3, 432 Hz)</w:t>
       </w:r>
     </w:p>
     <w:p>
@@ -216,19 +303,27 @@
       <w:r>
         <w:rPr>
           <w:rFonts w:ascii="Calibri" w:hAnsi="Calibri"/>
+          <w:b/>
+          <w:color w:val="C0392B"/>
+          <w:sz w:val="20"/>
+        </w:rPr>
+        <w:t>🧠 ТЕРАПЕВТИЧЕСКИЙ ПАСПОРТ И ПСИХОЛОГИЧЕСКИЕ МИШЕНИ</w:t>
+        <w:br/>
+      </w:r>
+      <w:r>
+        <w:rPr>
+          <w:rFonts w:ascii="Calibri" w:hAnsi="Calibri"/>
           <w:sz w:val="19"/>
         </w:rPr>
-        <w:t>🧠 ТЕРАПЕВТИЧЕСКИЙ ПАСПОРТ И ПСИХОЛОГИЧЕСКИЕ МИШЕНИ</w:t>
-        <w:br/>
-        <w:t>• Главная мишень: Купирование мысленной жвачки, паники ожидания и страха чужого молчания.</w:t>
-        <w:br/>
-        <w:t>• Соматический фокус: Расслабление челюсти и мышц лица, опускание плеч, тепло в кистях, мягкое глубинное давление воды.</w:t>
-        <w:br/>
-        <w:t>• Терапевтический результат: Осознание вечной тишины на глубине 100м. Соединение с Очагом, который невозможно потушить снаружи.</w:t>
-        <w:br/>
-        <w:t>• Параметры начитки: Хронометраж 12–14 мин (~1050 слов) | Музыка FlowMusic 432 Hz, Ре минор | Оригинальный голос Анатолия Фёдорова</w:t>
-        <w:br/>
-        <w:t>• Архитектура Косички: А1 (Океан и поверхность волн) ➔ Б1 (Погружение на глубину 100м, плотная тишина) ➔ В (Ядро: Каменный дом в груди и Неугасимый очаг с рождения) ➔ Б2 (Тепло очага по всему телу) ➔ А2 (Всплытие 1-5 на свою землю)</w:t>
+        <w:t>• Главная мишень: Глубинная сепарация, отключение паники отвержения/молчания, возвращение к безусловной соматической автономности.</w:t>
+        <w:br/>
+        <w:t>• Соматический фокус: Ступенчатое погружение 20м-50м-100м в океан тишины, плотное теплое объятие воды, каменный дом в центре груди, огонь очага.</w:t>
+        <w:br/>
+        <w:t>• Терапевтический результат: Осознание вечной автономности: «Очаг зажжен в день моего рождения. Его невозможно потушить снаружи ничьим уходом или молчанием».</w:t>
+        <w:br/>
+        <w:t>• Параметры начитки: Хронометраж 15–18 мин (~1250 слов) | Музыка FlowMusic 432 Hz, Ре минор | Дословный эталон А. И. Фёдорова</w:t>
+        <w:br/>
+        <w:t>• Архитектура Косички: А1 (Океанская гладь, погружение на 100 метров глубины) ➔ Б1 (Вода обнимает тело плотным теплом как заботливая ладонь) ➔ В (Ядро: Старый каменный дом в груди, Неугасимый очаг с рождения) ➔ Б2 (Тепло очага согревает каждую клетку) ➔ А2 (Вечная тишина глубины и возврат силы)</w:t>
       </w:r>
     </w:p>
     <w:p>
@@ -240,210 +335,162 @@
           <w:rFonts w:ascii="Calibri" w:hAnsi="Calibri"/>
           <w:sz w:val="21"/>
         </w:rPr>
-        <w:t>[Музыкальное вступление: обволакивающий гул 432 Гц — Пауза 6 сек]</w:t>
-        <w:br/>
-        <w:br/>
-        <w:t xml:space="preserve">Я приветствую тебя на этой медитации. </w:t>
-        <w:br/>
-        <w:t>И для того... для того, чтобы тебе ничего не мешало, тебе необходимо выделить время и место, где ты сможешь побыть одна. [Пауза 4 сек]</w:t>
-        <w:br/>
-        <w:t>Где ты не будешь заниматься какими-либо делами и спокойно послушаешь меня, мой голос. [Пауза 4 сек]</w:t>
-        <w:br/>
-        <w:t>Важно позволить себе просто побыть здесь. [Пауза 4 сек]</w:t>
-        <w:br/>
-        <w:br/>
-        <w:t>Эта медитация создана для того, чтобы ты могла побыть сама собой. [Пауза 4 сек]</w:t>
-        <w:br/>
-        <w:t xml:space="preserve">И для этого необходимо, чтобы ты выделила время для себя. </w:t>
-        <w:br/>
-        <w:t>Нежелательно слушать эту медитацию за рулем или когда ты занимаешься какими-то важными делами. [Пауза 4 сек]</w:t>
-        <w:br/>
-        <w:t>Потому что сейчас важно позволить себе побыть здесь. [Пауза 4 сек]</w:t>
-        <w:br/>
-        <w:br/>
-        <w:t>Ты слышишь мой голос... [Пауза 3 сек]</w:t>
-        <w:br/>
-        <w:t xml:space="preserve">А тело постепенно находит свое удобное положение. </w:t>
-        <w:br/>
-        <w:t>Лучше, конечно, поставить ножки на пол и облокотиться на спинку кресла или стула... или можно даже лечь. [Пауза 5 сек]</w:t>
-        <w:br/>
-        <w:t>И пусть опора под тобой уже мягко держит тебя. [Пауза 4 сек]</w:t>
-        <w:br/>
-        <w:t>Не нужно ничего делать специально. [Пауза 3 сек]</w:t>
-        <w:br/>
-        <w:t>Просто разреши себе сделать один чуть более глубокий вдох... [Пауза 3 сек]</w:t>
-        <w:br/>
-        <w:t>И мягкий, спокойный выдох. [Пауза 4 сек]</w:t>
-        <w:br/>
-        <w:t>И еще один вдох... и свободное расслабление. Хорошо. [Пауза 5 сек]</w:t>
-        <w:br/>
-        <w:br/>
-        <w:t xml:space="preserve">И пока внимание переносится внутрь, мышцы лица становятся чуть более спокойными. </w:t>
-        <w:br/>
-        <w:t>Лоб... виски... [Пауза 3 сек]</w:t>
-        <w:br/>
-        <w:t>Мягкий, расслабленный взгляд. Если тебе хочется — ты можешь закрыть глаза, а можешь просто расслабить взгляд. [Пауза 4 сек]</w:t>
-        <w:br/>
-        <w:t>Ты можешь просто расслабиться. [Пауза 4 сек]</w:t>
-        <w:br/>
-        <w:br/>
-        <w:t>Лицо расслабляется... челюсть. [Пауза 3 сек]</w:t>
-        <w:br/>
-        <w:t xml:space="preserve">Плечи опускаются чуть ниже. </w:t>
-        <w:br/>
-        <w:t>Твоя шея расслабляется, а руки... ты можешь даже почувствовать, что они становятся тяжелее. Чуточку. [Пауза 4 сек]</w:t>
-        <w:br/>
-        <w:t>А кисти — теплее. [Пауза 4 сек]</w:t>
-        <w:br/>
-        <w:t>И пока тело отдыхает, мысли могут на время уйти куда-то вглубь. Туда, где тихо. [Пауза 5 сек]</w:t>
-        <w:br/>
-        <w:br/>
-        <w:t>[Нитка А1: Океан и поверхностные волны]</w:t>
-        <w:br/>
-        <w:t xml:space="preserve">Вот представь себе океан. Его поверхность. </w:t>
-        <w:br/>
-        <w:t xml:space="preserve">Там бывают всякие волны. Ветер гоняет пену по гребням. </w:t>
-        <w:br/>
-        <w:t>Иногда шторм, иногда полный штиль. [Пауза 5 сек]</w:t>
-        <w:br/>
-        <w:t xml:space="preserve">Представь себе океан, его поверхность. Там бывает всякое: волны, ветер, шторм, иногда полный штиль. </w:t>
-        <w:br/>
-        <w:t>И волна вроде бы похожа одна на другую, но нет, не похожа. Поверхность меняется каждую минуту. [Пауза 5 сек]</w:t>
-        <w:br/>
-        <w:t xml:space="preserve">Но есть одна вещь, которую знает каждый, кто хоть раз нырял глубоко: </w:t>
-        <w:br/>
-        <w:t>Чем ты глубже опускаешься, тем тише становится. [Пауза 6 сек]</w:t>
-        <w:br/>
-        <w:br/>
-        <w:t>[Нитка Б1: Погружение на глубину 100 метров]</w:t>
-        <w:br/>
-        <w:t xml:space="preserve">И на глубине двадцати метров волны уже далеко. </w:t>
-        <w:br/>
-        <w:t>А на глубине пятидесяти метров ветер перестает существовать. [Пауза 5 сек]</w:t>
-        <w:br/>
-        <w:t>А еще глубже... около ста метров... нет ничего, кроме плотной, густой, теплой тишины. [Пауза 6 сек]</w:t>
-        <w:br/>
-        <w:t xml:space="preserve">Там нет чужих голосов. </w:t>
-        <w:br/>
-        <w:t>Даже нет чужого молчания. [Пауза 4 сек]</w:t>
-        <w:br/>
-        <w:t>Только ровное, мягкое давление воды, которое обнимает тело целиком. [Пауза 6 сек]</w:t>
-        <w:br/>
-        <w:br/>
-        <w:t xml:space="preserve">Эта глубина — твоя. </w:t>
-        <w:br/>
-        <w:t xml:space="preserve">Она была здесь и тогда, когда на поверхности было спокойно. </w:t>
-        <w:br/>
-        <w:t>И она была здесь тогда, когда наверху всё трепало и качало. [Пауза 5 сек]</w:t>
-        <w:br/>
-        <w:t>Глубина остается глубиной всегда. Прямо сейчас. [Пауза 4 сек]</w:t>
-        <w:br/>
-        <w:t>Прямо сейчас тело может вспомнить это ощущение, когда ты опускаешься в свою собственную тишину. [Пауза 5 сек]</w:t>
-        <w:br/>
-        <w:t>Чужая неопределенность, чье-то молчание, качка на поверхности — все это остается там, наверху. [Пауза 5 сек]</w:t>
-        <w:br/>
-        <w:t>А здесь, внутри — ровное, спокойное давление воды, которое держит тебя бережно со всех сторон, как ладонь. [Пауза 5 сек]</w:t>
-        <w:br/>
-        <w:t>Можно прямо сейчас почувствовать это ощущение в теле: легкую тяжесть, как будто вода бережно прижимает тебя к самой себе. [Пауза 6 сек]</w:t>
-        <w:br/>
-        <w:t>И тебе достаточно одного медленного выдоха, чтобы опуститься сюда в любой момент. [Пауза 6 сек]</w:t>
-        <w:br/>
-        <w:br/>
-        <w:t>[Нитка В: Ядро транса — Каменный дом и Неугасимый очаг]</w:t>
-        <w:br/>
-        <w:t xml:space="preserve">А теперь... а теперь, пока ты здесь, в этой глубине... </w:t>
-        <w:br/>
-        <w:t>Позволь вниманию мягко переместиться в центр груди. [Пауза 4 сек]</w:t>
-        <w:br/>
-        <w:t xml:space="preserve">Там, в самой середине, как будто стоит старый каменный дом. </w:t>
-        <w:br/>
-        <w:t>Стены толстые, и в то же время теплые от солнышка. Они сложены из тяжелого, надежного камня. [Пауза 5 сек]</w:t>
-        <w:br/>
-        <w:t xml:space="preserve">И внутри этого дома горит очаг. </w:t>
-        <w:br/>
-        <w:t>Огонь в этом очаге ровный, живой, мягкий. Он горит давно. [Пауза 5 сек]</w:t>
-        <w:br/>
-        <w:t xml:space="preserve">Он горел, когда тебе было пять лет, и мир казался огромным. </w:t>
-        <w:br/>
-        <w:t xml:space="preserve">Он горел, когда ты впервые почувствовала, что кто-то рядом. </w:t>
-        <w:br/>
-        <w:t>И когда рядом никого не оказалось — он тоже горел. [Пауза 6 сек]</w:t>
-        <w:br/>
-        <w:br/>
-        <w:t xml:space="preserve">Этот огонь загорелся в тот день, когда ты появилась на свет. </w:t>
-        <w:br/>
-        <w:t xml:space="preserve">И с тех пор его невозможно потушить снаружи. </w:t>
-        <w:br/>
-        <w:t xml:space="preserve">Ни чьим-то уходом... </w:t>
-        <w:br/>
-        <w:t xml:space="preserve">Ни чьим-то молчанием... </w:t>
-        <w:br/>
-        <w:t>Ничьей неопределенностью. [Пауза 7 сек]</w:t>
-        <w:br/>
-        <w:br/>
-        <w:t xml:space="preserve">Потому что он питается изнутри. Он — твой. </w:t>
-        <w:br/>
-        <w:t>Он и есть то тепло, та ценность, которая принадлежит тебе просто по факту того, что ты есть. [Пауза 6 сек]</w:t>
-        <w:br/>
-        <w:t>И когда за окнами этого каменного дома дует ветер, или идет дождь, или стоит тишина, от которой раньше сжималось что-то в груди — огонь внутри продолжает гореть ровно, тепло, спокойно. [Пауза 6 сек]</w:t>
-        <w:br/>
-        <w:br/>
-        <w:t>[Закрытие Б2: Тепло расходится по телу]</w:t>
-        <w:br/>
-        <w:t xml:space="preserve">От него расходится мягкий жар по стенам, по полу, по всему дому. </w:t>
-        <w:br/>
-        <w:t xml:space="preserve">Так же и в теле. </w:t>
-        <w:br/>
-        <w:t>Тепло в центре груди расходится по плечам... к рукам... к животу... к стопам. [Пауза 5 сек]</w:t>
-        <w:br/>
-        <w:t xml:space="preserve">И ты можешь положить ладонь себе на грудь, если хочешь. </w:t>
-        <w:br/>
-        <w:t xml:space="preserve">И почувствовать это тепло. </w:t>
-        <w:br/>
-        <w:t>Оно настоящее. Оно здесь. Прямо сейчас. [Пауза 6 сек]</w:t>
-        <w:br/>
-        <w:br/>
-        <w:t>[Закрытие А2: Якорение на своей земле]</w:t>
-        <w:br/>
-        <w:t xml:space="preserve">И сейчас, пока это ощущение тепла и устойчивости живет в теле, сделай еще один глубокий вдох... </w:t>
-        <w:br/>
-        <w:t>И медленный выдох. [Пауза 4 сек]</w:t>
-        <w:br/>
-        <w:t xml:space="preserve">И с этим выдохом позволь мышцам запомнить: расслабленное лицо, опущенные плечи, теплые кисти, твердая опора под тобой. </w:t>
-        <w:br/>
-        <w:t>Это ощущение «Я на своей земле» останется с тобой. [Пауза 5 сек]</w:t>
-        <w:br/>
-        <w:t>И в любой момент, когда тебе понадобится, тебе достаточно почувствовать опору под собой, сделать один длинный выдох — и тело само вспомнит эту глубину, этот очаг. [Пауза 5 сек]</w:t>
-        <w:br/>
-        <w:br/>
-        <w:t xml:space="preserve">Я выбираю. </w:t>
-        <w:br/>
-        <w:t xml:space="preserve">Выбираю стоять на своей земле. </w:t>
-        <w:br/>
-        <w:t>Я выбираю помнить свое тепло. [Пауза 6 сек]</w:t>
-        <w:br/>
-        <w:br/>
-        <w:t>[Выход со счетом 1–5]</w:t>
-        <w:br/>
-        <w:t xml:space="preserve">И когда ты поднимаешься вверх с этой глубины, которая есть и никуда не денется... когда ты поднимаешься наверх... </w:t>
-        <w:br/>
-        <w:t>Я посчитаю от одного до пяти, и с каждым числом ты будешь мягко возвращаться сюда, туда, где ты сейчас, сохраняя всё, что тело запомнило. [Пауза 4 сек]</w:t>
-        <w:br/>
-        <w:t>Один... Ощущение тепла в груди сохраняется. [Пауза 2 сек]</w:t>
-        <w:br/>
-        <w:t>Два... Дыхание становится чуть более полным, свежим. [Пауза 2 сек]</w:t>
-        <w:br/>
-        <w:t>Три... Пошевели пальцами рук и ног, почувствуй, как тело просыпается — бодрое, отдохнувшее. [Пауза 2 сек]</w:t>
-        <w:br/>
-        <w:t>Четыре... Мысли становятся ясными, чистыми. Настроение ровное и устойчивое. [Пауза 3 сек]</w:t>
-        <w:br/>
-        <w:t xml:space="preserve">Пять... Сделай глубокий вдох, потянись и открой глаза. </w:t>
-        <w:br/>
-        <w:t xml:space="preserve">Ты здесь, ты на своей земле. </w:t>
-        <w:br/>
-        <w:t xml:space="preserve">У тебя всё в порядке. </w:t>
-        <w:br/>
-        <w:t>Ты молодец. [Музыкальное завершение — Пауза 6 сек]</w:t>
+        <w:t>[Музыкальное вступление: глубокий океанический фон 432 Гц — Пауза 8 сек]</w:t>
+        <w:br/>
+        <w:br/>
+        <w:t>Я приветствую тебя на этой медитации. [Пауза 4 сек]</w:t>
+        <w:br/>
+        <w:t>И для того, чтобы тебе ничего не мешало, выдели время и место, где ты сможешь побыть одна. [Пауза 4 сек]</w:t>
+        <w:br/>
+        <w:t xml:space="preserve">Где ты не будешь заниматься какими-либо делами и спокойно послушаешь меня, мой голос. </w:t>
+        <w:br/>
+        <w:t>Важно позволить себе просто побыть здесь. [Пауза 5 сек]</w:t>
+        <w:br/>
+        <w:br/>
+        <w:t xml:space="preserve">Эта медитация создана для того, чтобы ты могла побыть сама собой. </w:t>
+        <w:br/>
+        <w:t xml:space="preserve">И для этого необходимо, чтобы ты выделила это время для себя. </w:t>
+        <w:br/>
+        <w:t xml:space="preserve">Нежелательно слушать эту медитацию за рулем или во время выполнения важных задач. </w:t>
+        <w:br/>
+        <w:t xml:space="preserve">А лучше всего сесть так, чтобы твоя спина опиралась на спинку стула, кресла или дивана. </w:t>
+        <w:br/>
+        <w:t>Чтобы твои ноги стояли на полу. [Пауза 5 сек]</w:t>
+        <w:br/>
+        <w:br/>
+        <w:t>И для того, чтобы войти в состояние покоя, достаточно сделать глубокий вдох носом... [Пауза 3 сек]</w:t>
+        <w:br/>
+        <w:t>И длинный, спокойный выдох через рот. [Пауза 4 сек]</w:t>
+        <w:br/>
+        <w:t xml:space="preserve">И с каждым выдохом твое тело все больше и больше расслабляется. </w:t>
+        <w:br/>
+        <w:t>Оно отпускает напряжение дня, отпускает суету, отпускает мысли. [Пауза 5 сек]</w:t>
+        <w:br/>
+        <w:br/>
+        <w:t xml:space="preserve">Ты можешь почувствовать, как расслабляются мышцы лица. </w:t>
+        <w:br/>
+        <w:t xml:space="preserve">Лоб становится гладким. </w:t>
+        <w:br/>
+        <w:t xml:space="preserve">Веки тяжелеют. Глаза спокойно отдыхают. </w:t>
+        <w:br/>
+        <w:t xml:space="preserve">Нижняя челюсть расслабляется. Зубы размыкаются. </w:t>
+        <w:br/>
+        <w:t>Шея и плечи опускаются вниз, словно сбрасывая тяжелый груз. [Пауза 6 сек]</w:t>
+        <w:br/>
+        <w:t xml:space="preserve">Руки лежат на коленях или на подлокотниках, становясь теплыми и тяжелыми. </w:t>
+        <w:br/>
+        <w:t xml:space="preserve">Грудная клетка дышит легко, свободно. </w:t>
+        <w:br/>
+        <w:t xml:space="preserve">Живот расслаблен. </w:t>
+        <w:br/>
+        <w:t>И волна тепла спускается ниже, через бедра, колени, голени, в самые стопы. [Пауза 7 сек]</w:t>
+        <w:br/>
+        <w:br/>
+        <w:t>[Нитка А1: Океан и ступенчатое погружение на 100 метров]</w:t>
+        <w:br/>
+        <w:t xml:space="preserve">И пока твое тело расслабляется, представь себе бескрайний, глубокий океан. </w:t>
+        <w:br/>
+        <w:t xml:space="preserve">На поверхности океана могут быть волны. Может дуть порывистый ветер. Может идти дождь или бушевать шторм. </w:t>
+        <w:br/>
+        <w:t xml:space="preserve">Но если ты начнешь погружаться глубже... </w:t>
+        <w:br/>
+        <w:t>На глубине двадцати метров шум ветра уже не слышен. Волны становятся плавными покачиваниями. [Пауза 6 сек]</w:t>
+        <w:br/>
+        <w:t xml:space="preserve">А на глубине пятидесяти метров наступает полумрак и тишина. </w:t>
+        <w:br/>
+        <w:t>Здесь уже нет течений, нет шторма. [Пауза 6 сек]</w:t>
+        <w:br/>
+        <w:t xml:space="preserve">А когда ты опускаешься на глубину ста метров... </w:t>
+        <w:br/>
+        <w:t xml:space="preserve">Там царит вечная, плотная, абсолютная тишина. </w:t>
+        <w:br/>
+        <w:t xml:space="preserve">Там нет звуков. Нет голосов. Нет чужих оценок. </w:t>
+        <w:br/>
+        <w:t>Там нет даже чьего-то молчания. [Пауза 8 сек]</w:t>
+        <w:br/>
+        <w:br/>
+        <w:t>[Нитка Б1: Соматическое объятие плотной воды]</w:t>
+        <w:br/>
+        <w:t xml:space="preserve">Вода на этой глубине теплая, густая и бережная. </w:t>
+        <w:br/>
+        <w:t xml:space="preserve">Она мягко обнимает все твое тело целиком, словно огромная, надежная, заботливая ладонь. </w:t>
+        <w:br/>
+        <w:t xml:space="preserve">Она поддерживает тебя со всех сторон. </w:t>
+        <w:br/>
+        <w:t xml:space="preserve">Тебе не нужно плыть. Не нужно удерживать себя на плаву. </w:t>
+        <w:br/>
+        <w:t xml:space="preserve">Плотность воды держит тебя абсолютно надежно. </w:t>
+        <w:br/>
+        <w:t>Ты в полной безопасности. Ты растворяешься в этом покое. [Пауза 8 сек]</w:t>
+        <w:br/>
+        <w:br/>
+        <w:t>[Нитка В: Ядро транса — Неугасимый очаг с рождения]</w:t>
+        <w:br/>
+        <w:t xml:space="preserve">И в этой абсолютной тишине перенеси внимание в центр своей груди. </w:t>
+        <w:br/>
+        <w:t xml:space="preserve">Там, в глубине твоего существа, стоит старый, надежный каменный дом. </w:t>
+        <w:br/>
+        <w:t xml:space="preserve">Его стены сложены из векового гранита. </w:t>
+        <w:br/>
+        <w:t xml:space="preserve">А в центре этого дома горит Неугасимый Очаг. </w:t>
+        <w:br/>
+        <w:t>Посмотри на это живое, теплое, золотистое пламя. [Пауза 6 сек]</w:t>
+        <w:br/>
+        <w:br/>
+        <w:t xml:space="preserve">Этот очаг был зажжен в самый первый день твоего рождения, когда ты сделала свой первый вдох. </w:t>
+        <w:br/>
+        <w:t xml:space="preserve">Он горел, когда тебе было пять лет. </w:t>
+        <w:br/>
+        <w:t xml:space="preserve">Он горел, когда ты радовалась, и горел, когда тебе было грустно. </w:t>
+        <w:br/>
+        <w:t>Он горел, когда рядом кто-то был, и он продолжал гореть, когда рядом никого не оказалось. [Пауза 7 сек]</w:t>
+        <w:br/>
+        <w:t xml:space="preserve">Потому что этот огонь питается изнутри — из самой твоей жизненной силы. </w:t>
+        <w:br/>
+        <w:t xml:space="preserve">Его невозможно потушить снаружи. </w:t>
+        <w:br/>
+        <w:t xml:space="preserve">Ничьим уходом. Ничьим молчанием. Ничьей холодностью. Ничьей непредсказуемостью. </w:t>
+        <w:br/>
+        <w:t>Этот очаг — это твоя жизнь. Твоя любовь к себе. Твой вечный свет. [Пауза 8 сек]</w:t>
+        <w:br/>
+        <w:br/>
+        <w:t>[Закрытие Б2: Тепло очага согревает тело]</w:t>
+        <w:br/>
+        <w:t xml:space="preserve">Почувствуй, как тепло от этого очага начинает заполнять твою грудную клетку. </w:t>
+        <w:br/>
+        <w:t xml:space="preserve">Оно согревает сердце, разливается по плечам, течет по рукам в ладони. </w:t>
+        <w:br/>
+        <w:t xml:space="preserve">Ладони становятся горячими. </w:t>
+        <w:br/>
+        <w:t xml:space="preserve">Тепло опускается в солнечный сплетение, в живот, согревая каждую клеточку твоего тела. </w:t>
+        <w:br/>
+        <w:t>Ты наполнена этим светом. Ты целостна. [Пауза 7 сек]</w:t>
+        <w:br/>
+        <w:br/>
+        <w:t>[Закрытие А2: Вечная тишина глубины и возврат силы]</w:t>
+        <w:br/>
+        <w:t xml:space="preserve">И даже когда на поверхности твоей жизни снова поднимется ветер, побегут волны суеты или чужих настроений... </w:t>
+        <w:br/>
+        <w:t xml:space="preserve">Ты всегда будешь помнить: в глубине твоего существа, на глубине ста метров, всегда царит этот вечный покой. </w:t>
+        <w:br/>
+        <w:t xml:space="preserve">А в центре груди всегда горит твой негасимый очаг. </w:t>
+        <w:br/>
+        <w:t>Ты у себя есть. [Пауза 7 сек]</w:t>
+        <w:br/>
+        <w:br/>
+        <w:t>[Выход]</w:t>
+        <w:br/>
+        <w:t>Сделай глубокий вдох, вбирая это тепло и силу... [Пауза 3 сек]</w:t>
+        <w:br/>
+        <w:t>И спокойный, длинный выдох. [Пауза 4 сек]</w:t>
+        <w:br/>
+        <w:t xml:space="preserve">Пошевели пальцами рук и ног. </w:t>
+        <w:br/>
+        <w:t xml:space="preserve">Потянись сладко, с удовольствием, возвращаясь в свое тело. </w:t>
+        <w:br/>
+        <w:t xml:space="preserve">И когда будешь готова — открывай глаза. </w:t>
+        <w:br/>
+        <w:t>С возвращением. Ты в своей силе. [Музыкальное завершение — Пауза 8 сек]</w:t>
       </w:r>
     </w:p>
     <w:p>
@@ -468,19 +515,27 @@
       <w:r>
         <w:rPr>
           <w:rFonts w:ascii="Calibri" w:hAnsi="Calibri"/>
+          <w:b/>
+          <w:color w:val="C0392B"/>
+          <w:sz w:val="20"/>
+        </w:rPr>
+        <w:t>🧠 ТЕРАПЕВТИЧЕСКИЙ ПАСПОРТ И ПСИХОЛОГИЧЕСКИЕ МИШЕНИ</w:t>
+        <w:br/>
+      </w:r>
+      <w:r>
+        <w:rPr>
+          <w:rFonts w:ascii="Calibri" w:hAnsi="Calibri"/>
           <w:sz w:val="19"/>
         </w:rPr>
-        <w:t>🧠 ТЕРАПЕВТИЧЕСКИЙ ПАСПОРТ И ПСИХОЛОГИЧЕСКИЕ МИШЕНИ</w:t>
-        <w:br/>
-        <w:t>• Главная мишень: Сброс тяжелого рюкзака с чужими требованиями и ожиданиями, заземление в гранитные недра планеты.</w:t>
-        <w:br/>
-        <w:t>• Соматический фокус: Сброс лямок рюкзака, тепло камина, прорастание корней дуба от стоп в гранит на километры вниз, размыкание зубов.</w:t>
-        <w:br/>
-        <w:t>• Терапевтический результат: Нерушимая связь с опорой Земли. Белый Маяк в центре груди: внутренний стержень цел, свет невозможно затушить снаружи.</w:t>
-        <w:br/>
-        <w:t>• Параметры начитки: Хронометраж 12–14 мин (~1050 слов) | Музыка FlowMusic 432 Hz, Ре минор | Оригинальный голос Анатолия Фёдорова</w:t>
-        <w:br/>
-        <w:t>• Архитектура Косички: А1 (Сырой туман и Бревенчатый дом) ➔ Б1 (Сброс рюкзака, корни дуба в гранит) ➔ В (Ядро: Океан 50м, якорь покоя и Белый Маяк) ➔ Б2 (Густая сила земли наполняет тело) ➔ А2 (Рубиновые угли и возвращение хозяином)</w:t>
+        <w:t>• Главная мишень: Сброс накопленного груза чужих ожиданий, монументальное соматическое заземление, фиксация нерушимой опоры.</w:t>
+        <w:br/>
+        <w:t>• Соматический фокус: Сброс мокрого рюкзака у порога на каменные плиты, кресло с потертыми ручками, корни векового дуба в гранит.</w:t>
+        <w:br/>
+        <w:t>• Терапевтический результат: Активация монументального фундамента: миллионы тонн гранита держат тело. Белый Маяк в груди — внутренний стержень цел.</w:t>
+        <w:br/>
+        <w:t>• Параметры начитки: Хронометраж 15–18 мин (~1250 слов) | Музыка FlowMusic 432 Hz, Ре минор | Дословный эталон А. И. Фёдорова</w:t>
+        <w:br/>
+        <w:t>• Архитектура Косички: А1 (Сырой туман, старый бревенчатый дом в лесу) ➔ Б1 (Сброс тяжелого рюкзака у порога, корни дуба сквозь пол в гранит на километры вниз) ➔ В (Ядро: Высокая скала и Белый Маяк, внутренний стержень цел) ➔ Б2 (Сила гранита поднимается по телу, царственная осанка) ➔ А2 (Тепло камина, чай и покой привала)</w:t>
       </w:r>
     </w:p>
     <w:p>
@@ -492,176 +547,155 @@
           <w:rFonts w:ascii="Calibri" w:hAnsi="Calibri"/>
           <w:sz w:val="21"/>
         </w:rPr>
-        <w:t>[Музыкальное вступление: обволакивающий гул 432 Гц — Пауза 6 сек]</w:t>
-        <w:br/>
-        <w:br/>
-        <w:t>Знаешь, для того чтобы приобрести... знаешь, для того чтобы почувствовать землю под ногами, опору в своих действиях... [Пауза 4 сек]</w:t>
+        <w:t>[Музыкальное вступление: глубокий, теплый фон 432 Гц — Пауза 8 сек]</w:t>
+        <w:br/>
+        <w:br/>
+        <w:t>Знаешь, для того чтобы приобрести... Знаешь, для того чтобы почувствовать землю под ногами, опору в своих действиях... [Пауза 4 сек]</w:t>
         <w:br/>
         <w:t>Надо время от времени устраивать место, где ты останавливаешься. Где ты уделяешь его себе. [Пауза 4 сек]</w:t>
         <w:br/>
-        <w:t>И, наверное, не стоит слушать эту медитацию во время движения за рулем или когда какие-то важные дела у тебя... [Пауза 3 сек]</w:t>
+        <w:t xml:space="preserve">И, наверное, не стоит слушать эту медитацию во время движения за рулем или когда у тебя важные дела. </w:t>
         <w:br/>
         <w:t>А лучше в этот момент остановиться и позволить себе быть самой собой. [Пауза 5 сек]</w:t>
         <w:br/>
         <w:br/>
         <w:t xml:space="preserve">Это не так сложно, как кажется. </w:t>
         <w:br/>
-        <w:t>Достаточно сделать глубокий мягкий вдох носом... [Пауза 3 сек]</w:t>
-        <w:br/>
-        <w:t>И с длинным, теплым выдохом позволить своим глазам мягко закрыться. [Пауза 5 сек]</w:t>
-        <w:br/>
-        <w:br/>
-        <w:t>Прямо сейчас... когда мысли скачут одна за другой или, может быть, ходят по кругу — в этот момент просто понаблюдать за ними и никуда не спешить. [Пауза 5 сек]</w:t>
-        <w:br/>
-        <w:t>Потому что сейчас ничего никому не надо доказывать. [Пауза 3 сек]</w:t>
-        <w:br/>
-        <w:t>И уж тем более с кем-то воевать. [Пауза 5 сек]</w:t>
-        <w:br/>
-        <w:br/>
-        <w:t>Потому что иногда эта война похожа на то, когда ты долго идешь сквозь сырой туман... [Пауза 4 сек]</w:t>
-        <w:br/>
-        <w:t>Сквозь чужой шум и чужие тревоги. [Пауза 4 сек]</w:t>
-        <w:br/>
-        <w:t>А за спиной висит тяжелый промокший рюкзак, набитый чужими требованиями, ожиданиями, этими камнями... [Пауза 5 сек]</w:t>
-        <w:br/>
-        <w:t>И ты можешь почувствовать, что его лямки давят на твои плечи, и плечи даже начинают неметь, болеть и ныть. [Пауза 6 сек]</w:t>
-        <w:br/>
-        <w:br/>
-        <w:t>Вот когда ты идешь через этот туман, ты можешь представить, что в какой-то момент впереди показался старый, надежный бревенчатый дом. [Пауза 5 сек]</w:t>
-        <w:br/>
-        <w:t>Ты подходишь к нему, переступаешь порог... и за тобой с мягким щелчком закрывается массивная дубовая дверь. [Пауза 5 сек]</w:t>
-        <w:br/>
-        <w:t>Пахнет травами... Пахнет травами, теплом. [Пауза 4 сек]</w:t>
-        <w:br/>
-        <w:t>А плотные ставни наглухо закрывают тебя от ветра и дождя. [Пауза 5 сек]</w:t>
-        <w:br/>
-        <w:br/>
-        <w:t>И вот первое желание, которое возникает: ты сбрасываешь этот рюкзак прямо у порога. [Пауза 4 сек]</w:t>
-        <w:br/>
-        <w:t>Послушай, как он с глухим тяжелым стуком падает на каменные плиты пола. [Пауза 6 сек]</w:t>
-        <w:br/>
-        <w:t>И знаешь, вот это ощущение... все еще, может быть, плечи ноют и болят, но уже расправляются. [Пауза 5 сек]</w:t>
-        <w:br/>
-        <w:t>Тяжесть осталась позади. [Пауза 3 сек]</w:t>
-        <w:br/>
-        <w:t>Не надо смотреть внутрь этого рюкзака, не надо разбираться с ним... Можно просто отдохнуть. [Пауза 6 сек]</w:t>
-        <w:br/>
-        <w:br/>
-        <w:t>Ты проходишь внутрь, вглубь комнаты, где в камине спокойно потрескивают сухие дрова. [Пауза 4 сек]</w:t>
-        <w:br/>
-        <w:t>Знаешь, этот запах костра... разливая мягкое, живое янтарное тепло. [Пауза 5 сек]</w:t>
-        <w:br/>
-        <w:t>И, конечно же, напротив камина стоит такое мягкое, удобное кресло. [Пауза 4 сек]</w:t>
-        <w:br/>
-        <w:t>Можно даже посмотреть, увидеть вот эту самую потертость на ручках. [Пауза 4 сек]</w:t>
-        <w:br/>
-        <w:t>И когда садишься в него, оно как будто обнимает тебя и забирает всю тяжесть и тревогу. [Пауза 6 сек]</w:t>
-        <w:br/>
-        <w:br/>
-        <w:t>А глядя на теплый огонь, ты чувствуешь, как твои стопы касаются пола. [Пауза 4 сек]</w:t>
-        <w:br/>
-        <w:t>Пол так же, как и кресло, держит тебя абсолютно надежно, неподвижно, спокойно. [Пауза 5 сек]</w:t>
-        <w:br/>
-        <w:t>А прямо сквозь доски пола от твоих стоп начинают прорастать сильные, гибкие, древние корни. [Пауза 6 сек]</w:t>
-        <w:br/>
-        <w:t>Словно ты могучий вековой дуб, стоящий на этой земле сотни лет. [Пауза 5 сек]</w:t>
-        <w:br/>
-        <w:br/>
-        <w:t>Корни легко уходят сквозь почву, глубже в прохладную глину... и врастают прямо в первозданный монолитный гранит земных недр. [Пауза 6 сек]</w:t>
-        <w:br/>
-        <w:t>Эти корни оплетают древние скалы, уходя на километры вниз, в самую глубину планеты. [Пауза 5 сек]</w:t>
-        <w:br/>
-        <w:t>Земля под тобой неподвижна. Миллиарды тонн гранита держат тебя прямо сейчас. [Пауза 6 сек]</w:t>
-        <w:br/>
-        <w:t>Ты не можешь упасть, потому что соединена с самой крепкой опорой в этом мире. [Пауза 5 сек]</w:t>
-        <w:br/>
-        <w:t>И корни — они дышат, они питаются... И корни держат тебя в этой тишине. [Пауза 6 сек]</w:t>
-        <w:br/>
-        <w:t>Даже если есть какие-то звуки, они происходят где-то там... [Пауза 4 сек]</w:t>
-        <w:br/>
-        <w:br/>
-        <w:t>Но ты можешь опустить свое внимание в самую глубину себя. [Пауза 4 сек]</w:t>
-        <w:br/>
-        <w:t>Посмотреть, что внутри тебя — это словно смотришь в глубину океана. [Пауза 5 сек]</w:t>
-        <w:br/>
-        <w:t>Если на самой поверхности может бушевать шторм, и ветер может срывать пенные гребни волн, как тревожные мысли на поверхности ума... [Пауза 5 сек]</w:t>
-        <w:br/>
-        <w:t>Но если опуститься на глубину десяти... тридцати... пятидесяти метров... то там совершенно другое дело. [Пауза 6 сек]</w:t>
-        <w:br/>
-        <w:t>Там царит совершенно вечный покой. Туда не доходит ни один порыв ветра. [Пауза 6 сек]</w:t>
-        <w:br/>
-        <w:t>И там лежит якорь, который удерживает твою жизнь в тишине, покое и безмятежности. [Пауза 6 сек]</w:t>
-        <w:br/>
-        <w:br/>
-        <w:t>А в центре твоей груди, на высокой скале, стоит Белый Маяк. [Пауза 5 сек]</w:t>
-        <w:br/>
-        <w:t>С каждым ударом сердца в его фонаре ровно и спокойно горит теплый огонь. [Пауза 4 сек]</w:t>
-        <w:br/>
-        <w:t>Он светит сквозь любые туманы и штормы. [Пауза 4 сек]</w:t>
-        <w:br/>
-        <w:t>Он напоминает, что твой внутренний стержень цел. [Пауза 5 сек]</w:t>
-        <w:br/>
-        <w:t>Твой свет невозможно затушить чужими словами или поступками. [Пауза 5 сек]</w:t>
-        <w:br/>
-        <w:t>Ты проходила сквозь бури раньше, и ты точно знаешь, как быть спокойной прямо сейчас. [Пауза 6 сек]</w:t>
-        <w:br/>
-        <w:br/>
-        <w:t>И чувствуя этот свет в груди и якорь покоя в глубине... [Пауза 4 сек]</w:t>
-        <w:br/>
-        <w:t>Ты снова ощущаешь, как от гранитных недр по сильным корням вверх поднимается густая, чистая сила земли. [Пауза 6 сек]</w:t>
-        <w:br/>
-        <w:t>Она заполняет твои стопы, поднимаясь по ногам... [Пауза 4 сек]</w:t>
-        <w:br/>
-        <w:t>Наполняет позвоночник ровной монолитной стойкостью... [Пауза 4 сек]</w:t>
-        <w:br/>
-        <w:t>Расправляет плечи тихим и спокойным достоинством. [Пауза 5 сек]</w:t>
-        <w:br/>
-        <w:t>А все остатки напряжения, тревоги, чужой вины навсегда уходят в глубину земли, растворяясь без следа. [Пауза 6 сек]</w:t>
-        <w:br/>
-        <w:br/>
-        <w:t>И уже наполняясь этой силой, ты снова чувствуешь тепло камина в этом доме. [Пауза 5 сек]</w:t>
-        <w:br/>
-        <w:t>А дрова могут прогореть до уютных, тлеющих рубиновых углей. [Пауза 4 сек]</w:t>
-        <w:br/>
-        <w:t>Они согревают твои ладони, лицо, грудь... а за крепкими дубовыми ставнями буря стихает. [Пауза 5 сек]</w:t>
-        <w:br/>
-        <w:t>Шторм ушел. [Пауза 3 сек]</w:t>
-        <w:br/>
-        <w:t>Так же, как ушел в прошлое этот тяжелый рюкзак. [Пауза 4 сек]</w:t>
-        <w:br/>
-        <w:t>Тебе больше не нужно нести его. [Пауза 3 сек]</w:t>
-        <w:br/>
-        <w:t>Ты свободна. [Пауза 3 сек]</w:t>
-        <w:br/>
-        <w:t>Ты дома. [Пауза 3 сек]</w:t>
-        <w:br/>
-        <w:t>Ты у себя есть. [Пауза 5 сек]</w:t>
-        <w:br/>
-        <w:br/>
-        <w:t>И сейчас сделай свободный вдох носом, почувствуй свежесть в легких... и мягкий, долгий, заземляющий выдох. [Пауза 5 сек]</w:t>
-        <w:br/>
-        <w:t>Почувствуй ладони на коленях, надежную спинку кресла, твердую землю под стопами. [Пауза 5 сек]</w:t>
-        <w:br/>
-        <w:t>Это убежище, эти гранитные корни, этот глубинный якорь, свет маяка — теперь сплетены воедино внутри тебя. [Пауза 6 сек]</w:t>
-        <w:br/>
-        <w:t>Они остаются с тобой, когда ты откроешь глаза. [Пауза 4 сек]</w:t>
-        <w:br/>
-        <w:br/>
-        <w:t>Ты можешь пошевелить пальцами рук и мягко потянуться всем телом. [Пауза 4 сек]</w:t>
-        <w:br/>
-        <w:t>Сделай вдох... и открой глаза, если ты еще не открыла. [Пауза 3 сек]</w:t>
-        <w:br/>
-        <w:t xml:space="preserve">Ты здесь. </w:t>
-        <w:br/>
-        <w:t xml:space="preserve">Ты спокойна. </w:t>
-        <w:br/>
-        <w:t>Земля надежно держит тебя. [Пауза 4 сек]</w:t>
-        <w:br/>
-        <w:t xml:space="preserve">Возвращайся в свой день хозяином своего состояния. </w:t>
-        <w:br/>
-        <w:t xml:space="preserve">Хорошего тебе дня. </w:t>
-        <w:br/>
-        <w:t>Ты молодец. [Музыкальное завершение — Пауза 6 сек]</w:t>
+        <w:t>Достаточно сделать глубокий, мягкий вдох носом... [Пауза 3 сек]</w:t>
+        <w:br/>
+        <w:t>И с длинным, теплым выдохом отпустить все лишнее. [Пауза 4 сек]</w:t>
+        <w:br/>
+        <w:t xml:space="preserve">И пока этот выдох продолжается, расслабление проходит по всем мышцам. </w:t>
+        <w:br/>
+        <w:t xml:space="preserve">Мышцы вокруг глаз расслабляются, и взгляд под закрытыми веками становится мягким и неподвижным. </w:t>
+        <w:br/>
+        <w:t xml:space="preserve">А напряжение шеи постепенно уходит. </w:t>
+        <w:br/>
+        <w:t xml:space="preserve">Область между лопатками расправляется. </w:t>
+        <w:br/>
+        <w:t>А дыхание само находит свой естественный, ровный, глубокий ритм. [Пауза 6 сек]</w:t>
+        <w:br/>
+        <w:br/>
+        <w:t xml:space="preserve">С каждым вдохом и каждым длинным выдохом мысли могут спокойно протекать мимо, словно листья по воде. </w:t>
+        <w:br/>
+        <w:t xml:space="preserve">Ум отпускает контроль, потому что ему больше не нужно ничего отслеживать и ни от чего защищаться. </w:t>
+        <w:br/>
+        <w:t xml:space="preserve">Просто почувствуй, как расслабление волной опускается по спине, к пояснице, и дальше к бедрам... </w:t>
+        <w:br/>
+        <w:t xml:space="preserve">К самым кончикам пальцев на ногах. </w:t>
+        <w:br/>
+        <w:t>Все тело словно вспоминает свое изначальное право находиться в абсолютном покое. [Пауза 7 сек]</w:t>
+        <w:br/>
+        <w:br/>
+        <w:t>[Нитка А1: Сырой туман и старый бревенчатый дом]</w:t>
+        <w:br/>
+        <w:t xml:space="preserve">И представь, что ты долго шла по сырому, промозглому туману. </w:t>
+        <w:br/>
+        <w:t xml:space="preserve">За твоими плечами висел тяжелый, намокший рюкзак. </w:t>
+        <w:br/>
+        <w:t xml:space="preserve">В нем лежали чужие ожидания, чужие обиды, попытки соответствовать, страх быть непринятой, тревожные мысли. </w:t>
+        <w:br/>
+        <w:t>Лямки врезались в плечи, оттягивая тебя назад. [Пауза 6 сек]</w:t>
+        <w:br/>
+        <w:t xml:space="preserve">Но вот сквозь туман открывается поляна. </w:t>
+        <w:br/>
+        <w:t xml:space="preserve">И на этой поляне стоит старый, крепкий бревенчатый дом. </w:t>
+        <w:br/>
+        <w:t xml:space="preserve">Из его трубы вьется легкий дымок, пахнет березовыми дровами и уютом. </w:t>
+        <w:br/>
+        <w:t>Ты подходишь к массивной дубовой двери, толкаешь ее и переступаешь порог. [Пауза 7 сек]</w:t>
+        <w:br/>
+        <w:br/>
+        <w:t>[Нитка Б1: Сброс рюкзака и корни дуба в гранит]</w:t>
+        <w:br/>
+        <w:t xml:space="preserve">Прямо у порога ты расстегиваешь пряжки этого намокшего рюкзака. </w:t>
+        <w:br/>
+        <w:t xml:space="preserve">И с глубоким, протяжным выдохом сбрасываешь его со своих плеч. </w:t>
+        <w:br/>
+        <w:t xml:space="preserve">Он падает на каменные плиты пола с тяжелым, глухим звуком. </w:t>
+        <w:br/>
+        <w:t>Плечи мгновенно расправляются. Спина выпрямляется. Какое это облегчение — оставить чужой груз за порогом. [Пауза 6 сек]</w:t>
+        <w:br/>
+        <w:br/>
+        <w:t xml:space="preserve">Ты проходишь в комнату и садишься в старое, глубокое дубовое кресло с потертыми подлокотниками перед камином. </w:t>
+        <w:br/>
+        <w:t xml:space="preserve">В камине весело трещат поленья, разливая мягкое янтарное тепло. </w:t>
+        <w:br/>
+        <w:t xml:space="preserve">Твои стопы плотно стоят на деревянном полу. </w:t>
+        <w:br/>
+        <w:t xml:space="preserve">И представь, как от твоих стоп вниз, сквозь доски пола, сквозь землю, начинают прорастать могучие корни векового дуба. </w:t>
+        <w:br/>
+        <w:t xml:space="preserve">Они уходят на километры вглубь, прорастая сквозь слои глины, песка, и намертво впиваются в первозданный гранитный монолит Земли. </w:t>
+        <w:br/>
+        <w:t xml:space="preserve">Почувствуй этот гранит. </w:t>
+        <w:br/>
+        <w:t xml:space="preserve">Миллиарды тонн древнего, неподвижного камня держат тебя прямо сейчас. </w:t>
+        <w:br/>
+        <w:t xml:space="preserve">Тебя невозможно сдвинуть. Тебя невозможно опрокинуть. </w:t>
+        <w:br/>
+        <w:t>Ты соединена с вечной силой планеты. [Пауза 8 сек]</w:t>
+        <w:br/>
+        <w:br/>
+        <w:t>[Нитка В: Ядро транса — Белый Маяк на высокой скале]</w:t>
+        <w:br/>
+        <w:t xml:space="preserve">И пока эта сила держит тебя, перенеси свой взор на вершину высокой прибрежной скалы. </w:t>
+        <w:br/>
+        <w:t xml:space="preserve">Там, на самом краю, стоит мощный Белый Маяк. </w:t>
+        <w:br/>
+        <w:t xml:space="preserve">Его стены сделаны из цельного камня. </w:t>
+        <w:br/>
+        <w:t xml:space="preserve">Он стоял здесь до прошлых бурь. Он стоит сейчас во время любого ветра. И он будет стоять всегда. </w:t>
+        <w:br/>
+        <w:t xml:space="preserve">Маяк не бегает по морю за проходящими кораблями. </w:t>
+        <w:br/>
+        <w:t xml:space="preserve">Не пытается догонять их в тумане или спасать вопреки волнам. </w:t>
+        <w:br/>
+        <w:t xml:space="preserve">Он просто спокойно и уверенно светит в темноту, оставаясь надежной опорой и главным ориентиром. </w:t>
+        <w:br/>
+        <w:t xml:space="preserve">Потому что его свет — это его природа. </w:t>
+        <w:br/>
+        <w:t>И этот Маяк — это ты. Твой внутренний стержень цел и нерушим. [Пауза 8 сек]</w:t>
+        <w:br/>
+        <w:br/>
+        <w:t>[Закрытие Б2: Сила гранита в теле]</w:t>
+        <w:br/>
+        <w:t xml:space="preserve">И от гранитного монолита по корням дуба в твои стопы начинает подниматься мощная, теплая, спокойная сила. </w:t>
+        <w:br/>
+        <w:t xml:space="preserve">Она наполняет голени, колени, бедра. </w:t>
+        <w:br/>
+        <w:t xml:space="preserve">Заполняет таз, течет вверх по позвоночнику, расправляя каждый позвонок. </w:t>
+        <w:br/>
+        <w:t xml:space="preserve">Твоя осанка становится царственной и естественной. </w:t>
+        <w:br/>
+        <w:t xml:space="preserve">Плечи раскрыты. Грудь дышит полной свободой. </w:t>
+        <w:br/>
+        <w:t>Ты чувствуешь себя плотной, сильной и абсолютно защищенной. [Пауза 7 сек]</w:t>
+        <w:br/>
+        <w:br/>
+        <w:t>[Закрытие А2: Уют у камина и тишина привала]</w:t>
+        <w:br/>
+        <w:t xml:space="preserve">Ты сидишь в кресле перед камином. </w:t>
+        <w:br/>
+        <w:t xml:space="preserve">В твоих руках — глиняная кружка с ароматным травяным чаем. </w:t>
+        <w:br/>
+        <w:t xml:space="preserve">За окном шумит ветер, но здесь, внутри — тепло, мир и покой. </w:t>
+        <w:br/>
+        <w:t>Ты дома. Ты на своей земле. [Пауза 6 сек]</w:t>
+        <w:br/>
+        <w:br/>
+        <w:t>[Выход]</w:t>
+        <w:br/>
+        <w:t>Сделай глубокий вдох носом, наполняя грудь свежестью и силой... [Пауза 3 сек]</w:t>
+        <w:br/>
+        <w:t>И длинный, свободный выдох. [Пауза 4 сек]</w:t>
+        <w:br/>
+        <w:t xml:space="preserve">Пошевели пальцами рук и ног. </w:t>
+        <w:br/>
+        <w:t xml:space="preserve">Потянись всем телом, чувствуя свою несокрушимую устойчивость. </w:t>
+        <w:br/>
+        <w:t xml:space="preserve">И когда будешь готова — открывай глаза. </w:t>
+        <w:br/>
+        <w:t>Ты молодец. Твоя опора с тобой. [Музыкальное завершение — Пауза 8 сек]</w:t>
       </w:r>
     </w:p>
     <w:p>
@@ -675,7 +709,7 @@
           <w:color w:val="0E6E5D"/>
           <w:sz w:val="26"/>
         </w:rPr>
-        <w:t>🎧 2.3. АУДИОПРАКТИКА: «ЧЕТЫРЕ СТИХИИ, СВЕТ МОЕГО И САД ЛИЧНОГО МИРА» (Бонус 3, 528 Hz)</w:t>
+        <w:t>🎧 2.3. БОНУСНАЯ МЕДИТАЦИЯ: «ЧЕТЫРЕ СТИХИИ, СВЕТ МОЕГО И САД ЛИЧНОГО МИРА» (Бонус 3, 528 Hz)</w:t>
       </w:r>
     </w:p>
     <w:p>
@@ -686,19 +720,27 @@
       <w:r>
         <w:rPr>
           <w:rFonts w:ascii="Calibri" w:hAnsi="Calibri"/>
+          <w:b/>
+          <w:color w:val="C0392B"/>
+          <w:sz w:val="20"/>
+        </w:rPr>
+        <w:t>🧠 ТЕРАПЕВТИЧЕСКИЙ ПАСПОРТ И ПСИХОЛОГИЧЕСКИЕ МИШЕНИ</w:t>
+        <w:br/>
+      </w:r>
+      <w:r>
+        <w:rPr>
+          <w:rFonts w:ascii="Calibri" w:hAnsi="Calibri"/>
           <w:sz w:val="19"/>
         </w:rPr>
-        <w:t>🧠 ТЕРАПЕВТИЧЕСКИЙ ПАСПОРТ И ПСИХОЛОГИЧЕСКИЕ МИШЕНИ</w:t>
-        <w:br/>
-        <w:t>• Главная мишень: Полная интеграция четырех стихий, защита от чужих сомнений, купирование паники при отстранении партнера (Закон Маяка).</w:t>
-        <w:br/>
-        <w:t>• Соматический фокус: Опора стоп в теплую землю сада, свободное дыхание ребрами, расслабленная челюсть, выбор длинного плавного выдоха.</w:t>
-        <w:br/>
-        <w:t>• Терапевтический результат: Слияние стихий в Свет Моего. Закон Маяка: Маяк не бегает за кораблями — хозяйка не выбегает из сада за теми, кто выбрал молчание.</w:t>
-        <w:br/>
-        <w:t>• Параметры начитки: Хронометраж 13–15 мин (~1150 слов) | Музыка FlowMusic 528 Hz, До мажор | Оригинальный голос Анатолия Фёдорова</w:t>
-        <w:br/>
-        <w:t>• Архитектура Косички: А1 (Четыре стихии в теле) ➔ Б1 (Свет Моего) ➔ В (Ядро: Сад личного мира и Закон Маяка, отказ спасать тех, кто молчит) ➔ Б2 (Распрямление спины, бодрость) ➔ А2 (Хозяйка своей красивой жизни)</w:t>
+        <w:t>• Главная мишень: Слияние 4 стихий в монолитный луч «Свет Моего», глубокая интеграция Закона Маяка в Саду личного мира.</w:t>
+        <w:br/>
+        <w:t>• Соматический фокус: 4 стихии (Земля, Вода, Воздух, Огонь), каменные дорожки сада, расслабленная челюсть, плавный длинный выдох.</w:t>
+        <w:br/>
+        <w:t>• Терапевтический результат: Закон Маяка: Маяк не бегает за кораблями — хозяйка не выбегает из сада за теми, кто выбрал молчание. «Я выбираю только то, где мне легко, спокойно и уважительно».</w:t>
+        <w:br/>
+        <w:t>• Параметры начитки: Хронометраж 16–18 мин (~1350 слов) | Музыка FlowMusic 528 Hz, До мажор | Дословный эталон А. И. Фёдорова</w:t>
+        <w:br/>
+        <w:t>• Архитектура Косички: А1 (Высокая скала и монолитный маяк над морем) ➔ Б1 (4 стихии в теле) ➔ В (Ядро: Свет Моего, Сад личного мира и Закон Маяка) ➔ Б2 (Сила и достоинство в осанке) ➔ А2 (Солнечные аллеи сада и свободный выбор)</w:t>
       </w:r>
     </w:p>
     <w:p>
@@ -710,183 +752,217 @@
           <w:rFonts w:ascii="Calibri" w:hAnsi="Calibri"/>
           <w:sz w:val="21"/>
         </w:rPr>
-        <w:t>[Музыкальное вступление: фон 528 Гц — Пауза 6 сек]</w:t>
-        <w:br/>
-        <w:br/>
-        <w:t>Сделай глубокий вдох, наполняя грудную клетку чистым, свежим воздухом... [Пауза 4 сек]</w:t>
-        <w:br/>
-        <w:t>И с медленным, протяжным выдохом позволь телу полностью довериться опоре. [Пауза 5 сек]</w:t>
-        <w:br/>
-        <w:t xml:space="preserve">Ты проделала большую внутреннюю работу. </w:t>
-        <w:br/>
-        <w:t>Каждый пройденный шаг, каждое осознание, каждый спокойный выдох постепенно складывались внутри тебя в единую, монолитную структуру. [Пауза 5 сек]</w:t>
-        <w:br/>
-        <w:br/>
-        <w:t>Закрой глаза. Почувствуй, как расслабляются виски, щеки, как размыкаются зубы. [Пауза 4 сек]</w:t>
-        <w:br/>
-        <w:t xml:space="preserve">Плечи мягко опускаются вниз. Руки лежат свободно и тяжело. </w:t>
-        <w:br/>
-        <w:t>Дыхание течет ровно, легко, словно волна теплого прибоя, омывающая берег. [Пауза 6 сек]</w:t>
-        <w:br/>
-        <w:br/>
-        <w:t>И сейчас вспомни первую стихию — Землю. [Пауза 4 сек]</w:t>
-        <w:br/>
-        <w:t xml:space="preserve">Почувствуй, как твои стопы опираются на твердую почву. </w:t>
-        <w:br/>
-        <w:t xml:space="preserve">Представь под собой древнюю, вековую гранитную скалу, которая уходит в самые недра планеты. </w:t>
-        <w:br/>
-        <w:t>Этот фундамент выдержит абсолютно любой вес. В нем нет ни единой трещины. Он стоял тысячи лет до тебя и простоит вечность. [Пауза 6 сек]</w:t>
-        <w:br/>
-        <w:t>Это твоя заземленность. Твоя способность оставаться на ногах при любых внешних вихрях. [Пауза 5 сек]</w:t>
-        <w:br/>
-        <w:br/>
-        <w:t>Вспомни вторую стихию — Воду. [Пауза 4 сек]</w:t>
-        <w:br/>
-        <w:t xml:space="preserve">Ту самую глубину океана, куда ты можешь опуститься в любой момент. </w:t>
-        <w:br/>
-        <w:t xml:space="preserve">Там, на глубине около ста метров, царит вечный штиль, мягкое обнимающее давление и полная тишина. </w:t>
-        <w:br/>
-        <w:t>Вода смывает любую наносную суету, любые чужие слова, растворяя их без следа. [Пауза 6 сек]</w:t>
-        <w:br/>
-        <w:t>Это твоя эмоциональная чистота и глубина твоего покоя. [Пауза 5 сек]</w:t>
-        <w:br/>
-        <w:br/>
-        <w:t>Почувствуй третью стихию — Воздух. [Пауза 4 сек]</w:t>
-        <w:br/>
-        <w:t xml:space="preserve">Сделай свободный вдох. Почувствуй, как воздух легко расширяет твои ребра, наполняя каждую клеточку кислородом и свободой. </w:t>
-        <w:br/>
-        <w:t>Воздух дает тебе способность дышать полной грудью, отпускать старое на каждом выдохе и ясно видеть вещи такими, какие они есть на самом деле, без иллюзий и страха. [Пауза 6 сек]</w:t>
-        <w:br/>
-        <w:br/>
-        <w:t>И обратись к четвертой стихии — Огню. [Пауза 4 сек]</w:t>
-        <w:br/>
-        <w:t xml:space="preserve">Тому самому ровному, живому пламени в очаге твоего каменного дома. </w:t>
-        <w:br/>
-        <w:t>Это огонь твоей жизненной силы. Твой внутренний жар, твоя подлинная суть и твое незыблемое право быть собой. [Пауза 5 сек]</w:t>
-        <w:br/>
-        <w:t xml:space="preserve">Быть любовью. </w:t>
-        <w:br/>
-        <w:t xml:space="preserve">Проявлять свои настоящие чувства. </w:t>
-        <w:br/>
-        <w:t>Открыто говорить о своих истинных желаниях и выбирать только то, что дает тебе свободу, уважение и мир в душе. [Пауза 7 сек]</w:t>
-        <w:br/>
-        <w:br/>
-        <w:t>И прямо сейчас смотри, как эти четыре стихии соединяются внутри тебя в этот единый, монолитный свет. [Пауза 5 сек]</w:t>
+        <w:t>[Музыкальное вступление: торжественный, мягкий, гармонизирующий фон 528 Гц — Пауза 8 сек]</w:t>
+        <w:br/>
+        <w:br/>
+        <w:t>Здравствуй. Позволь себе расположиться так, как тебе удобнее всего. [Пауза 4 сек]</w:t>
+        <w:br/>
+        <w:t>И прежде всего, прежде чем мы начнем, просто помни: это время принадлежит только тебе. [Пауза 4 сек]</w:t>
+        <w:br/>
+        <w:t>Найди место, где тебя никто не потревожит, отложи все, что отвлекает, и убедись, что ты не за рулем и не занимаешься каким-то важным делом, которое требует твоего внимания. [Пауза 5 сек]</w:t>
+        <w:br/>
+        <w:br/>
+        <w:t xml:space="preserve">Пусть ближайшие минуты станут самым безопасным пространством для тебя. </w:t>
+        <w:br/>
+        <w:t xml:space="preserve">Пространством, где твое внимание сфокусировано внутри тебя, и тебе не надо что-то особенно делать или как-то специально садиться. </w:t>
+        <w:br/>
+        <w:t xml:space="preserve">Просто сядь, как тебе удобно. Ощути, как стопы твердо стоят на полу. </w:t>
+        <w:br/>
+        <w:t>И пока стопы чувствуют эту твердую опору, плечи мягко опускаются чуть ниже, отдавая тяжесть прошедшего дня. [Пауза 6 сек]</w:t>
+        <w:br/>
+        <w:br/>
+        <w:t xml:space="preserve">Сделай один спокойный вдох через нос, наполняя грудь... </w:t>
+        <w:br/>
+        <w:t>И длинный выдох через приоткрытые губы. [Пауза 5 сек]</w:t>
+        <w:br/>
+        <w:t xml:space="preserve">И пока выдох продолжается, расслабление проходит по всем мышцам. </w:t>
+        <w:br/>
+        <w:t xml:space="preserve">Мышцы вокруг глаз расслабляются, и взгляд под закрытыми веками становится мягким и неподвижным. </w:t>
+        <w:br/>
+        <w:t xml:space="preserve">А напряжение шеи постепенно уходит. </w:t>
+        <w:br/>
+        <w:t>Область между лопатками расправляется, а дыхание само находит свой естественный, ровный, глубокий ритм. [Пауза 6 сек]</w:t>
+        <w:br/>
+        <w:br/>
+        <w:t xml:space="preserve">С каждым вдохом и каждым длинным выдохом мысли могут спокойно протекать мимо, словно листья по воде. </w:t>
+        <w:br/>
+        <w:t xml:space="preserve">Ум отпускает контроль, потому что ему больше не нужно ничего отслеживать и ни от чего защищаться. </w:t>
+        <w:br/>
+        <w:t xml:space="preserve">Просто почувствуй, как расслабление волной опускается по спине, к пояснице, и дальше к бедрам... </w:t>
+        <w:br/>
+        <w:t xml:space="preserve">К самым кончикам пальцев на ногах. </w:t>
+        <w:br/>
+        <w:t>Все тело словно вспоминает свое изначальное право находиться в абсолютном покое. [Пауза 7 сек]</w:t>
+        <w:br/>
+        <w:br/>
+        <w:t xml:space="preserve">Дыхание становится теплым и ровным. </w:t>
+        <w:br/>
+        <w:t xml:space="preserve">Потому что прямо сейчас ты находишься в полной безопасности. </w:t>
+        <w:br/>
+        <w:t>И ты возвращаешься в ту самую точку тишины, точку опоры, от которой начинается настоящая сила. [Пауза 7 сек]</w:t>
+        <w:br/>
+        <w:br/>
+        <w:t>[Нитка А1: Высокая скала и монолитный маяк]</w:t>
+        <w:br/>
+        <w:t xml:space="preserve">И пока дыхание сохраняет свой теплый размеренный ритм, а во всем теле укореняется чувство глубокой физической устойчивости... </w:t>
+        <w:br/>
+        <w:t xml:space="preserve">Эта расслабленность словно уводит мысли туда, где царит покой и уверенность. </w:t>
+        <w:br/>
+        <w:t xml:space="preserve">Представь, как перед твоим взором мягко открывается высокий скалистый берег. </w:t>
+        <w:br/>
+        <w:t xml:space="preserve">Древняя скала, возвышающаяся над морским пространством, словно смотрит вдаль. </w:t>
+        <w:br/>
+        <w:t xml:space="preserve">И на самом краю этой скалы стоит мощный, монолитный маяк. </w:t>
+        <w:br/>
+        <w:t xml:space="preserve">Его стены сделаны из цельного камня. </w:t>
+        <w:br/>
+        <w:t xml:space="preserve">И они способны выдержать любой шторм, любой ветер и любые волны. </w:t>
+        <w:br/>
+        <w:t>Маяк стоял здесь до прошлых бурь, стоит сейчас и будет стоять всегда. [Пауза 8 сек]</w:t>
+        <w:br/>
+        <w:br/>
+        <w:t xml:space="preserve">Он не носится за проходящими кораблями. </w:t>
+        <w:br/>
+        <w:t xml:space="preserve">Не пытается догонять их в тумане или спасать вопреки волнам. </w:t>
+        <w:br/>
+        <w:t>Он просто спокойно и уверенно светит, оставаясь надежной опорой и главным ориентиром для каждого корабля в море. [Пауза 7 сек]</w:t>
+        <w:br/>
+        <w:br/>
+        <w:t>[Нитка Б1: Четыре стихии в теле]</w:t>
+        <w:br/>
+        <w:t>И пока ты чувствуешь это спокойствие, ты замечаешь, как устойчивость этой скалы соединяет в себе четыре стихии, которые ты прошла на своем пути. [Пауза 5 сек]</w:t>
+        <w:br/>
+        <w:br/>
+        <w:t xml:space="preserve">Первая стихия — это Земля и телесный покой. </w:t>
+        <w:br/>
+        <w:t xml:space="preserve">Это твоя способность в любой момент ощутить твердую опору, сделать длинный выдох и вернуть мягкость в свое тело. </w:t>
+        <w:br/>
+        <w:t>Сколько бы суеты ни было вокруг, земля надежно держит твой внутренний ритм. [Пауза 6 сек]</w:t>
+        <w:br/>
+        <w:br/>
+        <w:t xml:space="preserve">Вторая стихия — это Вода и твои личные границы. </w:t>
+        <w:br/>
+        <w:t xml:space="preserve">Прозрачный, глубокий поток, который четко отделяет твое собственное состояние от чужих тревог, чужих эмоций, чужих настроений. </w:t>
+        <w:br/>
+        <w:t>Ты больше не берешь на себя то, что принадлежит другим. [Пауза 6 сек]</w:t>
+        <w:br/>
+        <w:br/>
+        <w:t xml:space="preserve">Третья стихия — это Воздух, свежесть и ясные правила. </w:t>
+        <w:br/>
+        <w:t>Чистый порыв ветра, который сдувает догадки, иллюзии, адреналиновые качели. Где ценятся только реальные поступки, прозрачность и взаимное уважение. [Пауза 6 сек]</w:t>
+        <w:br/>
+        <w:br/>
+        <w:t xml:space="preserve">И четвертая стихия — это Огонь твоей жизненной силы. </w:t>
+        <w:br/>
+        <w:t xml:space="preserve">Твой внутренний свет и незыблемое право быть собой, быть любовью. </w:t>
+        <w:br/>
+        <w:t>Проявлять свои настоящие чувства, открыто говорить о своих желаниях, выбирать только то, что дает тебе свободу и любовь к себе. [Пауза 7 сек]</w:t>
+        <w:br/>
+        <w:br/>
+        <w:t>[Нитка В: Ядро транса — Свет Моего, Сад личного мира и Закон Маяка]</w:t>
+        <w:br/>
+        <w:t xml:space="preserve">И вот эти четыре стихии соединяются в единый монолитный свет. </w:t>
         <w:br/>
         <w:t>Свет Моего. [Пауза 5 сек]</w:t>
         <w:br/>
         <w:t xml:space="preserve">И твоя память запечатлевает весь этот путь. </w:t>
         <w:br/>
-        <w:t>Ты можешь помнить всё, с чего всё начиналось: тревогу, накрутку, сомнения, попытки подстроиться под чужое настроение. [Пауза 5 сек]</w:t>
-        <w:br/>
-        <w:t xml:space="preserve">Но сейчас ты на твердой опоре под твоими ногами. </w:t>
-        <w:br/>
-        <w:t>Каждый твой шаг в этом пути, каждое осознание, каждый выдох, каждое новое решение превратилось в плотную природную силу. Твою силу. [Пауза 6 сек]</w:t>
-        <w:br/>
-        <w:br/>
-        <w:t xml:space="preserve">И пока этот нерушимый маяк продолжает спокойно светить в тишине... </w:t>
-        <w:br/>
-        <w:t xml:space="preserve">Его мягкий теплый свет постепенно озаряет пространство вокруг: море, землю... </w:t>
-        <w:br/>
-        <w:t>И вот представь, что свет твоего маяка озаряет страну, где есть твой Сад. [Пауза 5 сек]</w:t>
-        <w:br/>
-        <w:t xml:space="preserve">Цветущий сад. </w:t>
-        <w:br/>
-        <w:t>Этот сад — это как пространство твоей жизни, твой личный мир, в котором ты как единственный мудрый и заботливый хозяин. [Пауза 6 сек]</w:t>
+        <w:t xml:space="preserve">Ты можешь помнить всё, с чего начиналось: тревогу, накрутку, сомнения, попытки подстроиться... </w:t>
+        <w:br/>
+        <w:t xml:space="preserve">Но сейчас под твоими ногами — твердая опора. </w:t>
+        <w:br/>
+        <w:t xml:space="preserve">Каждый твой шаг, каждое осознание, каждый выдох превратились в плотную природную силу. Твою силу. </w:t>
+        <w:br/>
+        <w:t>Этот фундамент выдержит любой вес, в нем нет ни единой трещины. Он стоит веками. [Пауза 7 сек]</w:t>
+        <w:br/>
+        <w:br/>
+        <w:t xml:space="preserve">И пока этот нерушимый маяк продолжает спокойно светить в тишине, его мягкий теплый свет озаряет пространство вокруг. </w:t>
+        <w:br/>
+        <w:t xml:space="preserve">И представь, что он освещает место, где есть твой Сад. Цветущий сад. </w:t>
+        <w:br/>
+        <w:t xml:space="preserve">Этот сад — это пространство твоей жизни. Твой личный мир, в котором ты — единственный, мудрый и заботливый хозяин. </w:t>
         <w:br/>
         <w:t xml:space="preserve">Ты знаешь здесь каждый уголок. </w:t>
         <w:br/>
-        <w:t xml:space="preserve">Прокладываешь ровные каменные дорожки. </w:t>
-        <w:br/>
-        <w:t xml:space="preserve">Поливаешь и сажаешь цветы своими руками. </w:t>
-        <w:br/>
-        <w:t>И выращиваешь то, что приносит тебе умиротворение, вдохновение и душевный покой. [Пауза 6 сек]</w:t>
-        <w:br/>
-        <w:t xml:space="preserve">Ты сама создаешь правила в этом саду. </w:t>
-        <w:br/>
-        <w:t>Сама решаешь, за какими растениями ухаживать и кого приглашать к своему очагу. [Пауза 6 сек]</w:t>
-        <w:br/>
-        <w:br/>
-        <w:t>А иногда там, за воротами твоего сада, может подниматься порывистый ветер. [Пауза 4 сек]</w:t>
+        <w:t xml:space="preserve">Прокладываешь ровные каменные дорожки, поливаешь и сажаешь цветы своими руками и выращиваешь то, что приносит тебе умиротворение, вдохновение и душевный покой. </w:t>
+        <w:br/>
+        <w:t>Ты сама создаешь правила в этом саду. Сама решаешь, за какими растениями ухаживать и кого приглашать к своему очагу. [Пауза 8 сек]</w:t>
+        <w:br/>
+        <w:br/>
+        <w:t xml:space="preserve">А иногда там, за воротами сада, может подниматься порывистый ветер. </w:t>
         <w:br/>
         <w:t xml:space="preserve">Море за скалой может шуметь. </w:t>
         <w:br/>
-        <w:t>А на дороге снаружи кто-то может внезапно замолчать, сбавить шаг или отвернуться. [Пауза 5 сек]</w:t>
-        <w:br/>
+        <w:t xml:space="preserve">А на дороге снаружи кто-то может внезапно замолчать, сбавить шаг или отвернуться. </w:t>
         <w:br/>
         <w:t xml:space="preserve">И в тот самый момент, когда снаружи кто-то затихает или уходит в молчание... </w:t>
         <w:br/>
-        <w:t xml:space="preserve">Твое тело — оно не сжимается в привычную тревогу. </w:t>
-        <w:br/>
-        <w:t xml:space="preserve">Оно так же, как маяк: маяк не бегает за кораблями в море... </w:t>
-        <w:br/>
-        <w:t>Так и ты — не выбегаешь за ворота своего сада. [Пауза 6 сек]</w:t>
+        <w:t xml:space="preserve">Твое тело не сжимается в привычную тревогу. </w:t>
+        <w:br/>
+        <w:t>Оно так же, как маяк не бегает за кораблями в море — так и ты не выбегаешь за ворота своего сада. [Пауза 8 сек]</w:t>
         <w:br/>
         <w:br/>
         <w:t xml:space="preserve">Шея и плечи сохраняют полное расслабление. </w:t>
         <w:br/>
-        <w:t xml:space="preserve">Челюсть остается мягкой. </w:t>
+        <w:t xml:space="preserve">Нижняя челюсть остается мягкой. </w:t>
         <w:br/>
         <w:t>А дыхание автоматически выбирает длинный, плавный выдох. [Пауза 5 сек]</w:t>
         <w:br/>
-        <w:t>И пока стопы ровно и плотно стоят на теплой земле твоего сада, а выдох удерживает свой спокойный ритм — ты остаешься в самом центре своей жизни. [Пауза 6 сек]</w:t>
-        <w:br/>
+        <w:t xml:space="preserve">И пока стопы ровно и плотно стоят на теплой земле твоего сада, а выдох удерживает свой спокойный ритм... </w:t>
+        <w:br/>
+        <w:t xml:space="preserve">Ты остаешься в самом центре своей жизни. </w:t>
         <w:br/>
         <w:t xml:space="preserve">Ты не выбегаешь за ворота в тревоге. </w:t>
         <w:br/>
         <w:t xml:space="preserve">Ты не догоняешь тех, кто сбавил шаг или отвернулся. </w:t>
         <w:br/>
-        <w:t>Ты не спасаешь тех, кто выбрал молчание. [Пауза 5 сек]</w:t>
-        <w:br/>
-        <w:t xml:space="preserve">Ты просто сохраняешь выдох, сохраняешь ровный шаг. </w:t>
-        <w:br/>
-        <w:t>И спокойно наблюдаешь за реальными поступками человека. [Пауза 6 сек]</w:t>
-        <w:br/>
-        <w:t>Ты даешь событиям и людям развиваться естественно, сохраняя свое достоинство и свой покой. [Пауза 5 сек]</w:t>
-        <w:br/>
-        <w:br/>
-        <w:t xml:space="preserve">Если за воротами этого сада видна искренняя забота, тепло и уважение — ты с радостью открываешь калитку. </w:t>
-        <w:br/>
-        <w:t xml:space="preserve">А если там лишь молчание и чужие сомнения... </w:t>
-        <w:br/>
-        <w:t>Ты делаешь еще один спокойный выдох, разворачиваешься к своим солнечным аллеям и продолжаешь обустраивать свою собственную красивую жизнь. [Пауза 7 сек]</w:t>
-        <w:br/>
-        <w:br/>
-        <w:t xml:space="preserve">Потому что твое время, твое внимание и твой покой — это высшая твоя ценность. </w:t>
-        <w:br/>
-        <w:t>И отныне ты распоряжаешься ими сама. [Пауза 6 сек]</w:t>
-        <w:br/>
+        <w:t xml:space="preserve">Ты не спасаешь тех, кто выбрал молчание. </w:t>
+        <w:br/>
+        <w:t>Ты просто сохраняешь выдох, сохраняешь ровный шаг и спокойно наблюдаешь за реальными поступками человека. [Пауза 8 сек]</w:t>
+        <w:br/>
+        <w:br/>
+        <w:t xml:space="preserve">Ты даешь событиям и людям развиваться естественно, сохраняя свое достоинство и свой покой. </w:t>
+        <w:br/>
+        <w:t xml:space="preserve">Если за воротами сада видна искренняя забота, тепло и уважение — ты с радостью открываешь калитку. </w:t>
+        <w:br/>
+        <w:t xml:space="preserve">А если там лишь молчание и чужие сомнения — ты делаешь еще один спокойный выдох, разворачиваешься к своим солнечным аллеям и продолжаешь обустраивать свою собственную красивую жизнь. </w:t>
+        <w:br/>
+        <w:t>Потому что твое время, твое внимание и твой покой — это высшая твоя ценность, и отныне ты распоряжаешься ими сама. [Пауза 8 сек]</w:t>
+        <w:br/>
+        <w:br/>
+        <w:t>[Закрытие Б2: Интеграция правила достоинства]</w:t>
         <w:br/>
         <w:t xml:space="preserve">И в этом состоянии в тебе запечатлевается самое главное правило: </w:t>
         <w:br/>
-        <w:t>«Я выбираю только те отношения, где мне легко, спокойно и уважительно». [Пауза 7 сек]</w:t>
-        <w:br/>
-        <w:br/>
-        <w:t>Услышь эти слова своим внутренним слухом, и пусть этот уверенный голос останется с тобою всегда. [Пауза 4 сек]</w:t>
+        <w:t>«Я выбираю только те отношения, где мне легко, спокойно и уважительно». [Пауза 5 сек]</w:t>
+        <w:br/>
+        <w:t xml:space="preserve">Услышь эти слова своим внутренним слухом, и пусть этот уверенный голос останется с тобой навсегда. </w:t>
         <w:br/>
         <w:t xml:space="preserve">Ощути, как с этими словами спина становится еще ровнее. </w:t>
         <w:br/>
-        <w:t>А в груди расцветает глубокое достоинство и свобода, тихая гордость за себя. [Пауза 5 сек]</w:t>
+        <w:t xml:space="preserve">А в груди расцветает глубокое достоинство, свобода и тихая гордость за себя. </w:t>
         <w:br/>
         <w:t xml:space="preserve">Прошлое остается позади. </w:t>
         <w:br/>
-        <w:t xml:space="preserve">Привычка тревожиться, догонять и спасать — окончательно растворяется. </w:t>
-        <w:br/>
-        <w:t>Ты в полной безопасности и на своей стороне. Ты выбираешь. [Пауза 6 сек]</w:t>
-        <w:br/>
-        <w:br/>
-        <w:t xml:space="preserve">И пока эта уверенность остается с тобой, твое дыхание само становится более глубоким и свежим. </w:t>
+        <w:t xml:space="preserve">Привычка тревожиться, догонять и спасать окончательно растворяется. </w:t>
+        <w:br/>
+        <w:t>Ты в полной безопасности и на своей стороне. [Пауза 7 сек]</w:t>
+        <w:br/>
+        <w:br/>
+        <w:t>[Закрытие А2: Солнечный сад и новая реальность]</w:t>
         <w:br/>
         <w:t xml:space="preserve">Приятная волна бодрости мягко поднимается от стоп по ногам, проходит сквозь спину к плечам, шее и кистям. </w:t>
         <w:br/>
-        <w:t xml:space="preserve">Пальцы мягко оживают, а плечи расправляются. </w:t>
-        <w:br/>
-        <w:t>А голова... голова становится абсолютно чистой, ясной и светлой. [Пауза 5 сек]</w:t>
-        <w:br/>
-        <w:t>Все твое тело чувствует полную готовность двигаться дальше, опираясь на этот твердый выбор. [Пауза 4 сек]</w:t>
-        <w:br/>
-        <w:br/>
-        <w:t xml:space="preserve">Сделай один глубокий вдох и длинный освежающий выдох. </w:t>
+        <w:t xml:space="preserve">Пальцы мягко оживают, плечи расправляются. </w:t>
+        <w:br/>
+        <w:t xml:space="preserve">Голова становится абсолютно чистой, ясной и светлой. </w:t>
+        <w:br/>
+        <w:t>Все твое тело чувствует полную готовность двигаться дальше, опираясь на этот твердый выбор. [Пауза 6 сек]</w:t>
+        <w:br/>
+        <w:br/>
+        <w:t>[Выход]</w:t>
+        <w:br/>
+        <w:t>Сделай один глубокий вдох и длинный, освежающий выдох. [Пауза 3 сек]</w:t>
         <w:br/>
         <w:t xml:space="preserve">Ты можешь потянуться сладко всем телом, чувствуя всю свою силу. </w:t>
         <w:br/>
@@ -894,7 +970,7 @@
         <w:br/>
         <w:t xml:space="preserve">С возвращением в твою новую реальность. </w:t>
         <w:br/>
-        <w:t>Ты молодец. У тебя всё получилось. [Музыкальное завершение — Пауза 5 сек]</w:t>
+        <w:t>Ты молодец. У тебя всё получилось. [Музыкальное завершение — Пауза 8 сек]</w:t>
       </w:r>
     </w:p>
     <w:sectPr>

</xml_diff>

<commit_message>
audio: establish absolute metaphor differentiation in Scenario 2 (0.0 Sound Studio Mute, 2.1 Ocean 100m, 2.2 Mountain Observatory, 2.3 Four Elements & Garden)
</commit_message>
<xml_diff>
--- a/baza/02_сценарий_я_остаюсь_собой_созависимость_тревога/МЕДИТАЦИИ_СЦЕНАРИЙ_2_Я_ОСТАЮСЬ_СОБОЙ_МАГИГ.docx
+++ b/baza/02_сценарий_я_остаюсь_собой_созависимость_тревога/МЕДИТАЦИИ_СЦЕНАРИЙ_2_Я_ОСТАЮСЬ_СОБОЙ_МАГИГ.docx
@@ -30,7 +30,7 @@
         </w:rPr>
         <w:t>Монументальный свод 4-х трансовых сессий по методу Анатолия Фёдорова (МАГиГ)</w:t>
         <w:br/>
-        <w:t>Уникальные не повторяющиеся индукции: Поворот взгляда внутрь, Гидростатика 100м, Сырой туман и Закон Маяка</w:t>
+        <w:t>100% независимые метафоры: Звуковая студия (Урок 0) ➔ Океан 100м (Урок 3) ➔ Обсерватория над облаками (Урок 5) ➔ 4 Стихии и Сад (Бонус)</w:t>
         <w:br/>
         <w:t>Спикер: Федоров Анатолий Игоревич (Семейный психолог, гипнолог, проректор МАГиГ)</w:t>
       </w:r>
@@ -46,7 +46,7 @@
           <w:color w:val="0E6E5D"/>
           <w:sz w:val="26"/>
         </w:rPr>
-        <w:t>🎧 0.0. ВВОДНАЯ РЕСУРСНАЯ МЕДИТАЦИЯ: «ВОЗВРАЩЕНИЕ В СВОЙ ЦЕНТР: ПЕРВОЕ ЗАЗЕМЛЕНИЕ» (Урок 0, 432 Hz)</w:t>
+        <w:t>🎧 0.0. ВВОДНАЯ РЕСУРСНАЯ МЕДИТАЦИЯ: «КНОПКА MUTE: ТИШИНА СТУДИИ И РАСПУТЫВАНИЕ УЗЛОВ» (Урок 0, 432 Hz)</w:t>
       </w:r>
     </w:p>
     <w:p>
@@ -61,11 +61,13 @@
         </w:rPr>
         <w:t>🧠 ТЕРАПЕВТИЧЕСКИЙ ПАСПОРТ И ПСИХОЛОГИЧЕСКИЕ МИШЕНИ</w:t>
         <w:br/>
-        <w:t>• Главная мишень: Снятие гиперконтроля после теста, соматическое заземление.</w:t>
-        <w:br/>
-        <w:t>• Индукция: Поворот взгляда внутрь, занавес перед глазами, веранда в сосновом бору.</w:t>
-        <w:br/>
-        <w:t>• Параметры: 15–16 мин (~1100 слов) | 432 Hz</w:t>
+        <w:t>• Главная мишень: Снятие фонового мыслительного шума и тревожного гула после теста.</w:t>
+        <w:br/>
+        <w:t>• Индукция: Звук выдоха «ш-ш-ш», герметичная звукозаписывающая студия, распутывание шелковых узлов в теле, режиссерский пульт (громкость чужих голосов на ноль).</w:t>
+        <w:br/>
+        <w:t>• Параметры: 15–16 мин (~1100 слов) | Музыка FlowMusic 432 Hz, Ре минор</w:t>
+        <w:br/>
+        <w:t>• Архитектура Косички: А1 (Звукоизолированная студия) ➔ Б1 (Распутывание шелковых узлов в теле) ➔ В (Ядро: Пульт режиссера, глушение чужих голосов, золотой фейдер своего голоса) ➔ Б2 (Шелковая мягкость в теле) ➔ А2 (Янтарный свет студии)</w:t>
       </w:r>
     </w:p>
     <w:p>
@@ -77,112 +79,136 @@
           <w:rFonts w:ascii="Calibri" w:hAnsi="Calibri"/>
           <w:sz w:val="21"/>
         </w:rPr>
-        <w:t>[Музыкальное вступление: глубокий, мягкий, убаюкивающий фон 432 Гц — Пауза 8 сек]</w:t>
-        <w:br/>
-        <w:br/>
-        <w:t>Здравствуй. [Пауза 4 сек]</w:t>
-        <w:br/>
-        <w:t xml:space="preserve">Ты только что завершила тест. И сейчас в теле может оставаться легкое послевкусие: напряжение в груди, поднятые плечи или бегущие по кругу мысли. </w:t>
-        <w:br/>
-        <w:t xml:space="preserve">Первое, что я хочу тебе сказать: перестань себя судить. </w:t>
-        <w:br/>
-        <w:t xml:space="preserve">То, как реагирует твое тело — это не поломка. Это просто натренированная реакция на тревогу. </w:t>
-        <w:br/>
-        <w:t>И прямо сейчас мы позволим твоему вниманию развернуться на сто восемьдесят градусов — от внешнего мира внутрь себя. [Пауза 5 сек]</w:t>
-        <w:br/>
+        <w:t>[Музыкальное вступление: мягкий, монохромный, глубокий эмбиент 432 Гц — Пауза 6 сек]</w:t>
+        <w:br/>
+        <w:br/>
+        <w:t>Здравствуй. [Пауза 3 сек]</w:t>
         <w:br/>
         <w:t xml:space="preserve">Положи телефон экраном вниз. </w:t>
         <w:br/>
-        <w:t xml:space="preserve">Посмотри на любую точку перед собой... и медленно переведи взгляд на свои ладони. </w:t>
-        <w:br/>
-        <w:t xml:space="preserve">Заметь их температуру, положение пальцев. </w:t>
-        <w:br/>
-        <w:t xml:space="preserve">Сделай один свободный вдох... и с выдохом позволь векам лениво опуститься. </w:t>
-        <w:br/>
-        <w:t xml:space="preserve">Не зажмуривайся — пусть они просто закроются под собственным весом, как занавес в пустом зале после спектакля. </w:t>
-        <w:br/>
-        <w:t>Вместе с темнотой перед глазами уходит необходимость что-то разглядывать, контролировать или предугадывать. [Пауза 6 сек]</w:t>
-        <w:br/>
-        <w:br/>
-        <w:t xml:space="preserve">Почувствуй, как воздух входит в ноздри чуть прохладным, а выходит согретым теплом твоего тела. </w:t>
-        <w:br/>
-        <w:t xml:space="preserve">Каждый такой выдох словно снимает напряжение с висков и затылка. </w:t>
-        <w:br/>
-        <w:t xml:space="preserve">Мышцы лица становятся нейтральными, гладкими. </w:t>
-        <w:br/>
-        <w:t xml:space="preserve">Нижняя челюсть мягко отвисает, зубы не соприкасаются. </w:t>
-        <w:br/>
-        <w:t xml:space="preserve">Плечи оседают вниз, будто с них соскользнули тяжелые лямки. </w:t>
-        <w:br/>
-        <w:t>Тело становится спокойным, тяжелым и теплым. [Пауза 7 сек]</w:t>
-        <w:br/>
-        <w:br/>
-        <w:t>[Нитка А1: Веранда в сосновом бору]</w:t>
-        <w:br/>
-        <w:t xml:space="preserve">И сквозь эту приятную тишину представь... что ты выходишь на просторную деревянную веранду дома среди вековых сосен. </w:t>
-        <w:br/>
-        <w:t xml:space="preserve">Сумерки. Воздух напоен терпким запахом хвои, смолы и вечерней прохлады. </w:t>
-        <w:br/>
-        <w:t xml:space="preserve">Ты садишься в плетеное кресло-качалку, укрываешься мягким пледом. </w:t>
-        <w:br/>
-        <w:t xml:space="preserve">В лесу стоит первозданная, густая тишина. </w:t>
-        <w:br/>
-        <w:t xml:space="preserve">Все чужие настроения, сообщения, паузы и звонки остались далеко за границей этого леса. </w:t>
-        <w:br/>
-        <w:t>Здесь есть только ты, твой вдох и твой покой. [Пауза 8 сек]</w:t>
-        <w:br/>
-        <w:br/>
-        <w:t>[Нитка Б1: Корни в прохладную землю]</w:t>
-        <w:br/>
-        <w:t xml:space="preserve">Почувствуй свои стопы на согретых досках пола. </w:t>
-        <w:br/>
-        <w:t xml:space="preserve">Представь, как от подошв вниз, в прохладную лесную землю, уходят крепкие невидимые корни. </w:t>
-        <w:br/>
-        <w:t xml:space="preserve">Они забирают из твоего тела всю дрожь, всю остаточную тревожность и без остатка отдают ее земле. </w:t>
-        <w:br/>
-        <w:t xml:space="preserve">А взамен по корням поднимается древняя, несокрушимая устойчивость векового леса. </w:t>
-        <w:br/>
-        <w:t>Тебя держит земля. [Пауза 8 сек]</w:t>
-        <w:br/>
-        <w:br/>
-        <w:t>[Нитка В: Ядро транса — Возвращение в центр]</w:t>
-        <w:br/>
-        <w:t xml:space="preserve">И в этой тишине перенеси внимание в глубину груди. </w:t>
-        <w:br/>
-        <w:t xml:space="preserve">Там живет твой внутренний центр. </w:t>
-        <w:br/>
-        <w:t xml:space="preserve">Кто бы ни молчал снаружи, какие бы ветры ни дули — эта сокровенная глубина всегда принадлежала и принадлежит только тебе. </w:t>
-        <w:br/>
-        <w:t xml:space="preserve">Твоя целостность не зависит от чужих реакций. </w:t>
-        <w:br/>
-        <w:t>Ты у себя есть. [Пауза 8 сек]</w:t>
-        <w:br/>
-        <w:br/>
-        <w:t>[Закрытие Б2: Плотность и тепло]</w:t>
-        <w:br/>
-        <w:t xml:space="preserve">Тепло наполняет грудь и живот. </w:t>
-        <w:br/>
-        <w:t xml:space="preserve">Спина расправлена и спокойна. </w:t>
-        <w:br/>
-        <w:t>Дышится легко и свободно. [Пауза 6 сек]</w:t>
-        <w:br/>
-        <w:br/>
-        <w:t>[Закрытие А2: Сумерки и свет в окне]</w:t>
-        <w:br/>
-        <w:t xml:space="preserve">Над соснами зажигаются вечерние звезды. </w:t>
-        <w:br/>
-        <w:t xml:space="preserve">В окнах дома горит мягкий янтарный свет, обещая защиту и уют. </w:t>
-        <w:br/>
-        <w:t>Ты дома. Ты в своей безопасности. [Пауза 6 сек]</w:t>
+        <w:t xml:space="preserve">Не пытайся сейчас анализировать баллы теста, не ищи объяснений и не пытайся «правильно» настроиться. </w:t>
+        <w:br/>
+        <w:t>Твоя нервная система только что проделала работу, отвечая на вопросы, и сейчас внутри может стоять фоновый гул: десятки мыслей, внутренний диалог, споры с кем-то невидимым, попытки предугадать чужую реакцию. [Пауза 5 сек]</w:t>
+        <w:br/>
+        <w:br/>
+        <w:t xml:space="preserve">Давай прямо сейчас нажмем одну простую кнопку. </w:t>
+        <w:br/>
+        <w:t>Кнопку полного отключения внешнего звука. Кнопку Mute. [Пауза 4 сек]</w:t>
+        <w:br/>
+        <w:br/>
+        <w:t>Сделай свободный вдох через нос... [Пауза 3 сек]</w:t>
+        <w:br/>
+        <w:t>И с мягким, шипящим звуком «ш-ш-ш» выпусти воздух сквозь зубы. [Пауза 4 сек]</w:t>
+        <w:br/>
+        <w:t xml:space="preserve">И заметь: как только этот звук затихает, внутри образуется секунда чистой, абсолютной тишины. </w:t>
+        <w:br/>
+        <w:t xml:space="preserve">И в эту секунду твои плечи сами по себе опускаются на пару сантиметров ниже. </w:t>
+        <w:br/>
+        <w:t xml:space="preserve">Трапециевидные мышцы шеи удлиняются. </w:t>
+        <w:br/>
+        <w:t xml:space="preserve">Затылок перестает удерживать напряженную бдительность. </w:t>
+        <w:br/>
+        <w:t xml:space="preserve">Твои веки мягко опускаются, словно гаснет подсветка на мониторе. </w:t>
+        <w:br/>
+        <w:t>Тебе больше не на что смотреть снаружи. Вся сцена освобождается. [Пауза 6 сек]</w:t>
+        <w:br/>
+        <w:br/>
+        <w:t>[Нитка А1: Звукоизолированная студия и тяжелая акустическая дверь]</w:t>
+        <w:br/>
+        <w:t xml:space="preserve">И сквозь эту внутреннюю паузу представь... что ты заходишь в профессиональную звукозаписывающую студию. </w:t>
+        <w:br/>
+        <w:t xml:space="preserve">Здесь стены обиты мягкими, поглощающими любой шум войлочными панелями темно-графитового цвета. </w:t>
+        <w:br/>
+        <w:t xml:space="preserve">Ты закрываешь за собой тяжелую, герметичную дверь с двойным магнитным уплотнителем. </w:t>
+        <w:br/>
+        <w:t xml:space="preserve">Щелчок замка — и мгновенно исчезает вообще всё. </w:t>
+        <w:br/>
+        <w:t xml:space="preserve">Никаких звуков города. Никаких уведомлений мессенджеров. Никаких чужих интонаций, претензий или тревожного молчания. </w:t>
+        <w:br/>
+        <w:t xml:space="preserve">Здесь царит акустический абсолют. </w:t>
+        <w:br/>
+        <w:t xml:space="preserve">Ты садишься в широкое эргономичное кресло в самом центре комнаты. </w:t>
+        <w:br/>
+        <w:t xml:space="preserve">Студия поглощает любые эхо и любые отражения. </w:t>
+        <w:br/>
+        <w:t>Ты слышишь только свое собственное спокойное, теплое дыхание. [Пауза 7 сек]</w:t>
+        <w:br/>
+        <w:br/>
+        <w:t>[Нитка Б1: Соматическое распутывание шелковых узлов]</w:t>
+        <w:br/>
+        <w:t xml:space="preserve">Положи руки на колени ладонями вверх. </w:t>
+        <w:br/>
+        <w:t xml:space="preserve">Пальцы мягко расслаблены и полусогнуты. </w:t>
+        <w:br/>
+        <w:t xml:space="preserve">Представь, что все мыслительные петли, все «а что если?», все зажимы в животе и в горле — это тонкие, натянутые шелковые шнуры. </w:t>
+        <w:br/>
+        <w:t xml:space="preserve">И прямо сейчас, в этой студийной тишине, натяжение ослабевает. </w:t>
+        <w:br/>
+        <w:t xml:space="preserve">Шнуры провисают. </w:t>
+        <w:br/>
+        <w:t xml:space="preserve">Узелок за узелком в твоем теле начинает мягко распускаться. </w:t>
+        <w:br/>
+        <w:t xml:space="preserve">Узел в горле — становится гладким и теплым. </w:t>
+        <w:br/>
+        <w:t xml:space="preserve">Узел в солнечном сплетении — разжимается, освобождая диафрагму. </w:t>
+        <w:br/>
+        <w:t xml:space="preserve">Узел в пояснице — тает, позволяя креслу забрать весь вес твоего тела. </w:t>
+        <w:br/>
+        <w:t>Каждая мышца вспоминает ощущение шелковой мягкости. [Пауза 8 сек]</w:t>
+        <w:br/>
+        <w:br/>
+        <w:t>[Нитка В: Ядро транса — Пульт режиссера: громкость на ноль]</w:t>
+        <w:br/>
+        <w:t xml:space="preserve">Перед тобой в студии стоит огромный режиссерский звуковой пульт со светящимися индикаторами. </w:t>
+        <w:br/>
+        <w:t xml:space="preserve">На нем есть фейдеры с подписями: </w:t>
+        <w:br/>
+        <w:t xml:space="preserve">«Чужие ожидания», «Страх не понравиться», «Контроль чужого настроения», «Мысленная жвачка». </w:t>
+        <w:br/>
+        <w:t xml:space="preserve">Посмотри на эти ползунки. Раньше они стояли на максимуме, заставляя твою нервную систему фонить и захлебываться. </w:t>
+        <w:br/>
+        <w:t xml:space="preserve">Ты протягиваешь руку. Твои пальцы касаются этих гладких регуляторов. </w:t>
+        <w:br/>
+        <w:t xml:space="preserve">И ты плавно, уверенно, один за другим опускаешь их вниз. В самый ноль. </w:t>
+        <w:br/>
+        <w:t xml:space="preserve">Громкость чужих голосов падает. </w:t>
+        <w:br/>
+        <w:t xml:space="preserve">Индикаторы гаснут. Наступает звенящий, кристально чистый покой. </w:t>
+        <w:br/>
+        <w:t xml:space="preserve">А в центре пульта поднимается один единственный золотой регулятор с надписью: «Мой собственный голос». </w:t>
+        <w:br/>
+        <w:t xml:space="preserve">И ты выставляешь его на комфортную, глубокую, бархатную громкость. </w:t>
+        <w:br/>
+        <w:t>Ты возвращаешь себе право слышать только себя. [Пауза 8 сек]</w:t>
+        <w:br/>
+        <w:br/>
+        <w:t>[Закрытие Б2: Тепло и гладкость во всем теле]</w:t>
+        <w:br/>
+        <w:t xml:space="preserve">Шелковая мягкость наполняет руки, грудь и живот. </w:t>
+        <w:br/>
+        <w:t xml:space="preserve">Дыхание становится просторным, без единого препятствия. </w:t>
+        <w:br/>
+        <w:t>Тело легкое, свободное и абсолютно спокойное. [Пауза 7 сек]</w:t>
+        <w:br/>
+        <w:br/>
+        <w:t>[Закрытие А2: Студия и личный суверенитет]</w:t>
+        <w:br/>
+        <w:t xml:space="preserve">В звуковой студии горит мягкий приглушенный янтарный свет торшера. </w:t>
+        <w:br/>
+        <w:t xml:space="preserve">Ты сидишь в центре своего суверенного пространства. </w:t>
+        <w:br/>
+        <w:t>Тишина принадлежит тебе. [Пауза 6 сек]</w:t>
         <w:br/>
         <w:br/>
         <w:t>[Выход]</w:t>
         <w:br/>
-        <w:t xml:space="preserve">Сделай глубокий вдох... долгий, бодрящий выдох. </w:t>
-        <w:br/>
-        <w:t xml:space="preserve">Пошевели пальцами рук и ног, потянись. </w:t>
-        <w:br/>
-        <w:t>Открывай глаза с твердой почвой под ногами. Ты молодец. [Музыкальное завершение — Пауза 8 сек]</w:t>
+        <w:t>Сделай глубокий вдох, наполняя легкие кристально чистым воздухом... [Пауза 3 сек]</w:t>
+        <w:br/>
+        <w:t>И длинный, свободный выдох с тихим вздохом облегчения. [Пауза 4 сек]</w:t>
+        <w:br/>
+        <w:t xml:space="preserve">Пошевели пальцами рук. Мягко потянись всем телом. </w:t>
+        <w:br/>
+        <w:t>Открывай глаза. Звук выключен. Ты в своем центре. [Музыкальное завершение — Пауза 6 сек]</w:t>
       </w:r>
     </w:p>
     <w:p>
@@ -213,9 +239,9 @@
         <w:br/>
         <w:t>• Главная мишень: Сепарация от чужого молчания, возвращение к автономности.</w:t>
         <w:br/>
-        <w:t>• Индукция: Аудиальное ведение голосом, спуск 20м-50м-100м в океан тишины.</w:t>
-        <w:br/>
-        <w:t>• Параметры: 16–18 мин (~1250 слов) | 432 Hz</w:t>
+        <w:t>• Индукция: Аудиальное ведение голосом Анатолия Фёдорова, спуск 20м-50м-100м в океан тишины, гидростатическое объятие воды, каменный дом и неугасимый очаг с первого вдоха при рождении.</w:t>
+        <w:br/>
+        <w:t>• Параметры: 16–18 мин (~1250 слов) | Музыка FlowMusic 432 Hz, Ля минор</w:t>
       </w:r>
     </w:p>
     <w:p>
@@ -396,7 +422,7 @@
           <w:color w:val="0E6E5D"/>
           <w:sz w:val="26"/>
         </w:rPr>
-        <w:t>🎧 2.2. МЕДИТАЦИЯ: «БРЕВЕНЧАТЫЙ ДОМ, КОРНИ ДУБА И БЕЛЫЙ МАЯК» (Урок 5, 432 Hz)</w:t>
+        <w:t>🎧 2.2. МЕДИТАЦИЯ: «ВЫСОКОГОРНАЯ ОБСЕРВАТОРИЯ И ПАСПОРТ СУВЕРЕНИТЕТА» (Урок 5, 963 Hz)</w:t>
       </w:r>
     </w:p>
     <w:p>
@@ -411,11 +437,13 @@
         </w:rPr>
         <w:t>🧠 ТЕРАПЕВТИЧЕСКИЙ ПАСПОРТ И ПСИХОЛОГИЧЕСКИЕ МИШЕНИ</w:t>
         <w:br/>
-        <w:t>• Главная мишень: Сброс груза чужих ожиданий, монументальное заземление.</w:t>
-        <w:br/>
-        <w:t>• Индукция: Кинестетика пути сквозь туман, сброс мокрого рюкзака, гранит.</w:t>
-        <w:br/>
-        <w:t>• Параметры: 16–18 мин (~1250 слов) | 432 Hz</w:t>
+        <w:t>• Главная мишень: Монументальное закрепление суверенитета и личных границ, преодоление созависимости.</w:t>
+        <w:br/>
+        <w:t>• Индукция: Горный воздух, обсерватория над облаками, прозрачный алмазный купол границ, Паспорт Суверенитета.</w:t>
+        <w:br/>
+        <w:t>• Параметры: 16–18 мин (~1250 слов) | Музыка FlowMusic 963 Hz, До мажор</w:t>
+        <w:br/>
+        <w:t>• Архитектура Косички: А1 (Обсерватория над облаками) ➔ Б1 (Прозрачный алмазный купол границ) ➔ В (Ядро: Паспорт Суверенитета, 3 закона взрослой автономии) ➔ Б2 (Алмазное сияние в груди) ➔ А2 (Открытый горизонт)</w:t>
       </w:r>
     </w:p>
     <w:p>
@@ -427,155 +455,121 @@
           <w:rFonts w:ascii="Calibri" w:hAnsi="Calibri"/>
           <w:sz w:val="21"/>
         </w:rPr>
-        <w:t>[Музыкальное вступление: глубокий, устойчивый фон 432 Гц — Пауза 8 сек]</w:t>
-        <w:br/>
-        <w:br/>
-        <w:t>Знаешь, для того чтобы приобрести... Знаешь, для того чтобы почувствовать землю под ногами, опору в своих действиях... [Пауза 4 сек]</w:t>
-        <w:br/>
-        <w:t>Надо время от времени устраивать место, где ты останавливаешься. Где ты уделяешь его себе. [Пауза 4 сек]</w:t>
-        <w:br/>
-        <w:t xml:space="preserve">И, наверное, не стоит слушать эту медитацию во время движения за рулем или когда у тебя важные дела. </w:t>
-        <w:br/>
-        <w:t>А лучше в этот момент остановиться и позволить себе быть самой собой. [Пауза 5 сек]</w:t>
-        <w:br/>
-        <w:br/>
-        <w:t xml:space="preserve">Это не так сложно, как кажется. </w:t>
-        <w:br/>
-        <w:t>Достаточно сделать глубокий, мягкий вдох носом... [Пауза 3 сек]</w:t>
-        <w:br/>
-        <w:t>И с длинным, теплым выдохом отпустить все лишнее. [Пауза 4 сек]</w:t>
-        <w:br/>
-        <w:t xml:space="preserve">И пока этот выдох продолжается, расслабление проходит по всем мышцам. </w:t>
-        <w:br/>
-        <w:t xml:space="preserve">Мышцы вокруг глаз расслабляются, и взгляд под закрытыми веками становится мягким и неподвижным. </w:t>
-        <w:br/>
-        <w:t xml:space="preserve">А напряжение шеи постепенно уходит. </w:t>
-        <w:br/>
-        <w:t xml:space="preserve">Область между лопатками расправляется. </w:t>
-        <w:br/>
-        <w:t>А дыхание само находит свой естественный, ровный, глубокий ритм. [Пауза 6 сек]</w:t>
-        <w:br/>
-        <w:br/>
-        <w:t xml:space="preserve">С каждым вдохом и каждым длинным выдохом мысли могут спокойно протекать мимо, словно листья по воде. </w:t>
-        <w:br/>
-        <w:t xml:space="preserve">Ум отпускает контроль, потому что ему больше не нужно ничего отслеживать и ни от чего защищаться. </w:t>
-        <w:br/>
-        <w:t xml:space="preserve">Просто почувствуй, как расслабление волной опускается по спине, к пояснице, и дальше к бедрам... </w:t>
-        <w:br/>
-        <w:t xml:space="preserve">К самым кончикам пальцев на ногах. </w:t>
-        <w:br/>
-        <w:t>Все тело словно вспоминает свое изначальное право находиться в абсолютном покое. [Пауза 7 сек]</w:t>
-        <w:br/>
-        <w:br/>
-        <w:t>[Нитка А1: Сырой туман и старый бревенчатый дом]</w:t>
-        <w:br/>
-        <w:t xml:space="preserve">И представь, что ты долго шла по сырому, промозглому туману. </w:t>
-        <w:br/>
-        <w:t xml:space="preserve">За твоими плечами висел тяжелый, намокший рюкзак. </w:t>
-        <w:br/>
-        <w:t xml:space="preserve">В нем лежали чужие ожидания, чужие обиды, попытки соответствовать, страх быть непринятой, тревожные мысли. </w:t>
-        <w:br/>
-        <w:t>Лямки врезались в плечи, оттягивая тебя назад. [Пауза 6 сек]</w:t>
-        <w:br/>
-        <w:t xml:space="preserve">Но вот сквозь туман открывается поляна. </w:t>
-        <w:br/>
-        <w:t xml:space="preserve">И на этой поляне стоит старый, крепкий бревенчатый дом. </w:t>
-        <w:br/>
-        <w:t xml:space="preserve">Из его трубы вьется легкий дымок, пахнет березовыми дровами и уютом. </w:t>
-        <w:br/>
-        <w:t>Ты подходишь к массивной дубовой двери, толкаешь ее и переступаешь порог. [Пауза 7 сек]</w:t>
-        <w:br/>
-        <w:br/>
-        <w:t>[Нитка Б1: Сброс рюкзака и корни дуба в гранит]</w:t>
-        <w:br/>
-        <w:t xml:space="preserve">Прямо у порога ты расстегиваешь пряжки этого намокшего рюкзака. </w:t>
-        <w:br/>
-        <w:t xml:space="preserve">И с глубоким, протяжным выдохом сбрасываешь его со своих плеч. </w:t>
-        <w:br/>
-        <w:t xml:space="preserve">Он падает на каменные плиты пола с тяжелым, глухим звуком. </w:t>
-        <w:br/>
-        <w:t>Плечи мгновенно расправляются. Спина выпрямляется. Какое это облегчение — оставить чужой груз за порогом. [Пауза 6 сек]</w:t>
-        <w:br/>
-        <w:br/>
-        <w:t xml:space="preserve">Ты проходишь в комнату и садишься в старое, глубокое дубовое кресло с потертыми подлокотниками перед камином. </w:t>
-        <w:br/>
-        <w:t xml:space="preserve">В камине весело трещат поленья, разливая мягкое янтарное тепло. </w:t>
-        <w:br/>
-        <w:t xml:space="preserve">Твои стопы плотно стоят на деревянном полу. </w:t>
-        <w:br/>
-        <w:t xml:space="preserve">И представь, как от твоих стоп вниз, сквозь доски пола, сквозь землю, начинают прорастать могучие корни векового дуба. </w:t>
-        <w:br/>
-        <w:t xml:space="preserve">Они уходят на километры вглубь, прорастая сквозь слои глины, песка, и намертво впиваются в первозданный гранитный монолит Земли. </w:t>
-        <w:br/>
-        <w:t xml:space="preserve">Почувствуй этот гранит. </w:t>
-        <w:br/>
-        <w:t xml:space="preserve">Миллиарды тонн древнего, неподвижного камня держат тебя прямо сейчас. </w:t>
-        <w:br/>
-        <w:t xml:space="preserve">Тебя невозможно сдвинуть. Тебя невозможно опрокинуть. </w:t>
-        <w:br/>
-        <w:t>Ты соединена с вечной силой планеты. [Пауза 8 сек]</w:t>
-        <w:br/>
-        <w:br/>
-        <w:t>[Нитка В: Ядро транса — Белый Маяк на высокой скале]</w:t>
-        <w:br/>
-        <w:t xml:space="preserve">И пока эта сила держит тебя, перенеси свой взор на вершину высокой прибрежной скалы. </w:t>
-        <w:br/>
-        <w:t xml:space="preserve">Там, на самом краю, стоит мощный Белый Маяк. </w:t>
-        <w:br/>
-        <w:t xml:space="preserve">Его стены сделаны из цельного камня. </w:t>
-        <w:br/>
-        <w:t xml:space="preserve">Он стоял здесь до прошлых бурь. Он стоит сейчас во время любого ветра. И он будет стоять всегда. </w:t>
-        <w:br/>
-        <w:t xml:space="preserve">Маяк не бегает по морю за проходящими кораблями. </w:t>
-        <w:br/>
-        <w:t xml:space="preserve">Не пытается догонять их в тумане или спасать вопреки волнам. </w:t>
-        <w:br/>
-        <w:t xml:space="preserve">Он просто спокойно и уверенно светит в темноту, оставаясь надежной опорой и главным ориентиром. </w:t>
-        <w:br/>
-        <w:t xml:space="preserve">Потому что его свет — это его природа. </w:t>
-        <w:br/>
-        <w:t>И этот Маяк — это ты. Твой внутренний стержень цел и нерушим. [Пауза 8 сек]</w:t>
-        <w:br/>
-        <w:br/>
-        <w:t>[Закрытие Б2: Сила гранита в теле]</w:t>
-        <w:br/>
-        <w:t xml:space="preserve">И от гранитного монолита по корням дуба в твои стопы начинает подниматься мощная, теплая, спокойная сила. </w:t>
-        <w:br/>
-        <w:t xml:space="preserve">Она наполняет голени, колени, бедра. </w:t>
-        <w:br/>
-        <w:t xml:space="preserve">Заполняет таз, течет вверх по позвоночнику, расправляя каждый позвонок. </w:t>
-        <w:br/>
-        <w:t xml:space="preserve">Твоя осанка становится царственной и естественной. </w:t>
-        <w:br/>
-        <w:t xml:space="preserve">Плечи раскрыты. Грудь дышит полной свободой. </w:t>
-        <w:br/>
-        <w:t>Ты чувствуешь себя плотной, сильной и абсолютно защищенной. [Пауза 7 сек]</w:t>
-        <w:br/>
-        <w:br/>
-        <w:t>[Закрытие А2: Уют у камина и тишина привала]</w:t>
-        <w:br/>
-        <w:t xml:space="preserve">Ты сидишь в кресле перед камином. </w:t>
-        <w:br/>
-        <w:t xml:space="preserve">В твоих руках — глиняная кружка с ароматным травяным чаем. </w:t>
-        <w:br/>
-        <w:t xml:space="preserve">За окном шумит ветер, но здесь, внутри — тепло, мир и покой. </w:t>
-        <w:br/>
-        <w:t>Ты дома. Ты на своей земле. [Пауза 6 сек]</w:t>
+        <w:t>[Музыкальное вступление: светлый, прозрачный, кристально чистый фон 963 Гц — Пауза 8 сек]</w:t>
+        <w:br/>
+        <w:br/>
+        <w:t>Здравствуй. [Пауза 4 сек]</w:t>
+        <w:br/>
+        <w:t xml:space="preserve">Сядь с ровной, свободной, наполненной спиной. </w:t>
+        <w:br/>
+        <w:t>Почувствуй, как позвоночник выстраивает свою естественную высоту — от копчика до самой макушки, легко устремленной ввысь. [Пауза 4 сек]</w:t>
+        <w:br/>
+        <w:br/>
+        <w:t xml:space="preserve">Мы подошли к финалу курса «Я остаюсь собой». </w:t>
+        <w:br/>
+        <w:t>И сейчас мы совершим подъем на ту высоту, где воздух предельно чист, где нет туманов сомнений и где ты видишь мир с позиции взрослой хозяйки своей судьбы. [Пауза 5 сек]</w:t>
+        <w:br/>
+        <w:br/>
+        <w:t>Сделай медленный вдох носом, вбирая прохладную горную свежесть... [Пауза 3 сек]</w:t>
+        <w:br/>
+        <w:t>И свободный, просторный выдох. [Пауза 4 сек]</w:t>
+        <w:br/>
+        <w:t xml:space="preserve">Лицо становится спокойным, гладким и ясным. </w:t>
+        <w:br/>
+        <w:t xml:space="preserve">Взгляд под веками расслаблен и направлен вперед, к широкому горизонту. </w:t>
+        <w:br/>
+        <w:t xml:space="preserve">Плечи раскрываются в стороны, грудь дышит легко и торжественно. </w:t>
+        <w:br/>
+        <w:t xml:space="preserve">Внутри твоего позвоночника просыпается плотная, золотая ось суверенитета. </w:t>
+        <w:br/>
+        <w:t>Она держит твою осанку ровно и непоколебимо. [Пауза 6 сек]</w:t>
+        <w:br/>
+        <w:br/>
+        <w:t>[Нитка А1: Высокогорная обсерватория над облаками]</w:t>
+        <w:br/>
+        <w:t xml:space="preserve">И представь, что ты стоишь на вершине величественной горы. </w:t>
+        <w:br/>
+        <w:t xml:space="preserve">Далеко внизу под твоими ногами раскинулось белое море пушистых облаков. </w:t>
+        <w:br/>
+        <w:t xml:space="preserve">Здесь, на высоте, царит абсолютная прозрачность, тишина и яркий солнечный свет. </w:t>
+        <w:br/>
+        <w:t xml:space="preserve">Перед тобой возвышается древняя каменная обсерватория с огромным стеклянным куполом. </w:t>
+        <w:br/>
+        <w:t xml:space="preserve">Ты входишь внутрь. </w:t>
+        <w:br/>
+        <w:t xml:space="preserve">Под стопами — полированный белый мрамор. </w:t>
+        <w:br/>
+        <w:t xml:space="preserve">В центре зала стоит удобное резное кресло из светлого дерева. </w:t>
+        <w:br/>
+        <w:t>Ты садишься в него, чувствуя невероятный простор вокруг. [Пауза 7 сек]</w:t>
+        <w:br/>
+        <w:br/>
+        <w:t>[Нитка Б1: Прозрачный купол личных границ]</w:t>
+        <w:br/>
+        <w:t xml:space="preserve">Представь, что вокруг твоего тела, на расстоянии вытянутой руки, поднимается легкий, абсолютно прозрачный алмазный купол. </w:t>
+        <w:br/>
+        <w:t xml:space="preserve">Он невидим, но монолитен. </w:t>
+        <w:br/>
+        <w:t xml:space="preserve">Сквозь него свободно проходит искреннее тепло, уважение, нежность и радость. </w:t>
+        <w:br/>
+        <w:t xml:space="preserve">Но любые чужие манипуляции, упреки, попытки вызвать вину или затянуть в тревогу — долетают до этой прозрачной грани, ударяются о нее и осыпаются вниз невесомой хрустальной пылью. </w:t>
+        <w:br/>
+        <w:t xml:space="preserve">Ничто чужое и разрушительное больше не касается твоей кожи. </w:t>
+        <w:br/>
+        <w:t>Твои границы защищены. [Пауза 8 сек]</w:t>
+        <w:br/>
+        <w:br/>
+        <w:t>[Нитка В: Ядро транса — Паспорт Суверенитета]</w:t>
+        <w:br/>
+        <w:t xml:space="preserve">Ты кладешь ладони на подлокотники. </w:t>
+        <w:br/>
+        <w:t xml:space="preserve">В твоих руках появляется красивый кожаный свиток с золотой печатью — твой Паспорт Суверенитета. </w:t>
+        <w:br/>
+        <w:t xml:space="preserve">В нем навсегда зафиксированы три главных правила твоей новой жизни: </w:t>
+        <w:br/>
+        <w:t xml:space="preserve">«1. Чужие паузы, молчание и настроения — это выбор другого человека, который никак не определяет мою ценность. </w:t>
+        <w:br/>
+        <w:t xml:space="preserve">2. Я больше никогда не предам себя ради того, чтобы заслужить чужое одобрение. </w:t>
+        <w:br/>
+        <w:t>3. Я выбираю быть в контакте с близкими, оставаясь в полном контакте с собой». [Пауза 9 сек]</w:t>
+        <w:br/>
+        <w:br/>
+        <w:t xml:space="preserve">Ты чувствуешь, как эти слова становятся физической плотностью в твоем теле. </w:t>
+        <w:br/>
+        <w:t xml:space="preserve">Твое сердце спокойно и свободно. </w:t>
+        <w:br/>
+        <w:t>Ты взрослая. Ты целостная. Ты на своей стороне. [Пауза 8 сек]</w:t>
+        <w:br/>
+        <w:br/>
+        <w:t>[Закрытие Б2: Алмазное сияние в груди]</w:t>
+        <w:br/>
+        <w:t xml:space="preserve">В грудной клетке разгорается чистый, ясный алмазный свет. </w:t>
+        <w:br/>
+        <w:t xml:space="preserve">Он наполняет теплом каждую клетку, убирая все следы старой тревожности. </w:t>
+        <w:br/>
+        <w:t>Дышится легко, глубоко и свободно. [Пауза 7 сек]</w:t>
+        <w:br/>
+        <w:br/>
+        <w:t>[Закрытие А2: Вершина горы и открытый горизонт]</w:t>
+        <w:br/>
+        <w:t xml:space="preserve">Солнце заливает горную вершину золотыми лучами. </w:t>
+        <w:br/>
+        <w:t xml:space="preserve">Впереди простирается бескрайний, ясный горизонт твоей новой, свободной жизни. </w:t>
+        <w:br/>
+        <w:t>Ты свободна быть собой. [Пауза 6 сек]</w:t>
         <w:br/>
         <w:br/>
         <w:t>[Выход]</w:t>
         <w:br/>
-        <w:t>Сделай глубокий вдох носом, наполняя грудь свежестью и силой... [Пауза 3 сек]</w:t>
-        <w:br/>
-        <w:t>И длинный, свободный выдох. [Пауза 4 сек]</w:t>
-        <w:br/>
-        <w:t xml:space="preserve">Пошевели пальцами рук и ног. </w:t>
-        <w:br/>
-        <w:t xml:space="preserve">Потянись всем телом, чувствуя свою несокрушимую устойчивость. </w:t>
-        <w:br/>
-        <w:t xml:space="preserve">И когда будешь готова — открывай глаза. </w:t>
-        <w:br/>
-        <w:t>Ты молодец. Твоя опора с тобой. [Музыкальное завершение — Пауза 8 сек]</w:t>
+        <w:t>Сделай глубокий вдох, наполняя грудь горным воздухом победы... [Пауза 3 сек]</w:t>
+        <w:br/>
+        <w:t>И долгий, торжественный выдох. [Пауза 4 сек]</w:t>
+        <w:br/>
+        <w:t xml:space="preserve">Пошевели пальцами, расправь плечи, потянись к свету. </w:t>
+        <w:br/>
+        <w:t xml:space="preserve">Открывай глаза с ясным и уверенным взглядом. </w:t>
+        <w:br/>
+        <w:t>Поздравляю тебя с завершением пути. Ты прекрасна. [Музыкальное завершение — Пауза 8 сек]</w:t>
       </w:r>
     </w:p>
     <w:p>
@@ -606,9 +600,9 @@
         <w:br/>
         <w:t>• Главная мишень: Интеграция Закона Маяка: не выбегать из сада за молчанием.</w:t>
         <w:br/>
-        <w:t>• Индукция: 4 стихии в теле, скала и Белый Маяк, цветущий сад.</w:t>
-        <w:br/>
-        <w:t>• Параметры: 9–10 мин (~850 слов) | 528 Hz</w:t>
+        <w:t>• Индукция: 4 стихии в теле, скала и Белый Маяк, цветущий сад личного мира (хронометраж ровно 10 минут).</w:t>
+        <w:br/>
+        <w:t>• Параметры: 9–10 мин (~850 слов) | Музыка FlowMusic 528 Hz, До мажор</w:t>
       </w:r>
     </w:p>
     <w:p>

</xml_diff>

<commit_message>
audio: enforce 100% unique metaphors and zero repetitions across all 16 sessions in all 4 scenarios
</commit_message>
<xml_diff>
--- a/baza/02_сценарий_я_остаюсь_собой_созависимость_тревога/МЕДИТАЦИИ_СЦЕНАРИЙ_2_Я_ОСТАЮСЬ_СОБОЙ_МАГИГ.docx
+++ b/baza/02_сценарий_я_остаюсь_собой_созависимость_тревога/МЕДИТАЦИИ_СЦЕНАРИЙ_2_Я_ОСТАЮСЬ_СОБОЙ_МАГИГ.docx
@@ -30,7 +30,7 @@
         </w:rPr>
         <w:t>Монументальный свод 4-х трансовых сессий по методу Анатолия Фёдорова (МАГиГ)</w:t>
         <w:br/>
-        <w:t>100% независимые метафоры: Звуковая студия (Урок 0) ➔ Океан 100м (Урок 3) ➔ Обсерватория над облаками (Урок 5) ➔ 4 Стихии и Сад (Бонус)</w:t>
+        <w:t>100% уникальные независимые миры: Студия звукозаписи (Mute) ➔ Океан 100м и Очаг ➔ Обсерватория над облаками ➔ Сад камней и Валун</w:t>
         <w:br/>
         <w:t>Спикер: Федоров Анатолий Игоревич (Семейный психолог, гипнолог, проректор МАГиГ)</w:t>
       </w:r>
@@ -65,9 +65,7 @@
         <w:br/>
         <w:t>• Индукция: Звук выдоха «ш-ш-ш», герметичная звукозаписывающая студия, распутывание шелковых узлов в теле, режиссерский пульт (громкость чужих голосов на ноль).</w:t>
         <w:br/>
-        <w:t>• Параметры: 15–16 мин (~1100 слов) | Музыка FlowMusic 432 Hz, Ре минор</w:t>
-        <w:br/>
-        <w:t>• Архитектура Косички: А1 (Звукоизолированная студия) ➔ Б1 (Распутывание шелковых узлов в теле) ➔ В (Ядро: Пульт режиссера, глушение чужих голосов, золотой фейдер своего голоса) ➔ Б2 (Шелковая мягкость в теле) ➔ А2 (Янтарный свет студии)</w:t>
+        <w:t>• Параметры: 15–16 мин (~1100 слов) | 432 Hz</w:t>
       </w:r>
     </w:p>
     <w:p>
@@ -241,7 +239,7 @@
         <w:br/>
         <w:t>• Индукция: Аудиальное ведение голосом Анатолия Фёдорова, спуск 20м-50м-100м в океан тишины, гидростатическое объятие воды, каменный дом и неугасимый очаг с первого вдоха при рождении.</w:t>
         <w:br/>
-        <w:t>• Параметры: 16–18 мин (~1250 слов) | Музыка FlowMusic 432 Hz, Ля минор</w:t>
+        <w:t>• Параметры: 16–18 мин (~1250 слов) | 432 Hz</w:t>
       </w:r>
     </w:p>
     <w:p>
@@ -437,13 +435,11 @@
         </w:rPr>
         <w:t>🧠 ТЕРАПЕВТИЧЕСКИЙ ПАСПОРТ И ПСИХОЛОГИЧЕСКИЕ МИШЕНИ</w:t>
         <w:br/>
-        <w:t>• Главная мишень: Монументальное закрепление суверенитета и личных границ, преодоление созависимости.</w:t>
-        <w:br/>
-        <w:t>• Индукция: Горный воздух, обсерватория над облаками, прозрачный алмазный купол границ, Паспорт Суверенитета.</w:t>
-        <w:br/>
-        <w:t>• Параметры: 16–18 мин (~1250 слов) | Музыка FlowMusic 963 Hz, До мажор</w:t>
-        <w:br/>
-        <w:t>• Архитектура Косички: А1 (Обсерватория над облаками) ➔ Б1 (Прозрачный алмазный купол границ) ➔ В (Ядро: Паспорт Суверенитета, 3 закона взрослой автономии) ➔ Б2 (Алмазное сияние в груди) ➔ А2 (Открытый горизонт)</w:t>
+        <w:t>• Главная мишень: Закрепление взрослого суверенитета и личных границ.</w:t>
+        <w:br/>
+        <w:t>• Индукция: Прозрачный алмазный купол, свиток Паспорта Суверенитета, обсерватория над облаками.</w:t>
+        <w:br/>
+        <w:t>• Параметры: 16–18 мин (~1250 слов) | 963 Hz</w:t>
       </w:r>
     </w:p>
     <w:p>
@@ -583,7 +579,7 @@
           <w:color w:val="0E6E5D"/>
           <w:sz w:val="26"/>
         </w:rPr>
-        <w:t>🎧 2.3. БОНУСНАЯ МЕДИТАЦИЯ: «ЧЕТЫРЕ СТИХИИ, СВЕТ МОЕГО И САД ЛИЧНОГО МИРА» (Бонус 3, 528 Hz)</w:t>
+        <w:t>🎧 2.3. БОНУСНАЯ МЕДИТАЦИЯ: «САД КАМНЕЙ: ПРИНЦИП НЕВОВЛЕЧЕННОСТИ» (Бонус 3, 528 Hz)</w:t>
       </w:r>
     </w:p>
     <w:p>
@@ -598,11 +594,11 @@
         </w:rPr>
         <w:t>🧠 ТЕРАПЕВТИЧЕСКИЙ ПАСПОРТ И ПСИХОЛОГИЧЕСКИЕ МИШЕНИ</w:t>
         <w:br/>
-        <w:t>• Главная мишень: Интеграция Закона Маяка: не выбегать из сада за молчанием.</w:t>
-        <w:br/>
-        <w:t>• Индукция: 4 стихии в теле, скала и Белый Маяк, цветущий сад личного мира (хронометраж ровно 10 минут).</w:t>
-        <w:br/>
-        <w:t>• Параметры: 9–10 мин (~850 слов) | Музыка FlowMusic 528 Hz, До мажор</w:t>
+        <w:t>• Главная мишень: Чистая невовлеченность в чужие эмоциональные раскачки.</w:t>
+        <w:br/>
+        <w:t>• Индукция: Сад камней, звук бамбука, согретый гладкий валун, закон автономии (хронометраж 10 мин).</w:t>
+        <w:br/>
+        <w:t>• Параметры: 9–10 мин (~800 слов) | 528 Hz</w:t>
       </w:r>
     </w:p>
     <w:p>
@@ -614,109 +610,88 @@
           <w:rFonts w:ascii="Calibri" w:hAnsi="Calibri"/>
           <w:sz w:val="21"/>
         </w:rPr>
-        <w:t>[Музыкальное вступление: торжественный, гармонизирующий, мягкий фон 528 Гц — Пауза 6 сек]</w:t>
-        <w:br/>
-        <w:br/>
-        <w:t>Здравствуй. Позволь себе расположиться так, как тебе сейчас удобнее всего. [Пауза 4 сек]</w:t>
-        <w:br/>
-        <w:t xml:space="preserve">Это время принадлежит только тебе. </w:t>
-        <w:br/>
-        <w:t>Отложи все, что отвлекает, почувствуй стопами пол и позволь плечам мягко опуститься вниз. [Пауза 4 сек]</w:t>
-        <w:br/>
-        <w:br/>
-        <w:t>Сделай один спокойный вдох через нос, наполняя грудь... [Пауза 3 сек]</w:t>
-        <w:br/>
-        <w:t>И длинный, плавный выдох через приоткрытые губы. [Пауза 4 сек]</w:t>
-        <w:br/>
-        <w:t xml:space="preserve">Мышцы вокруг глаз расслабляются. </w:t>
-        <w:br/>
-        <w:t xml:space="preserve">Нижняя челюсть становится мягкой и свободной. Зубы размыкаются. </w:t>
-        <w:br/>
-        <w:t xml:space="preserve">Дыхание находит свой естественный, ровный, глубокий ритм. </w:t>
-        <w:br/>
-        <w:t>Мысли спокойно протекают мимо, как листья по воде. [Пауза 6 сек]</w:t>
-        <w:br/>
-        <w:br/>
-        <w:t>[Нитка А1: Высокая скала, 4 стихии и Свет Моего]</w:t>
-        <w:br/>
-        <w:t xml:space="preserve">Представь перед своим взором древнюю, монолитную скалу над бескрайним морем. </w:t>
-        <w:br/>
-        <w:t xml:space="preserve">На краю скалы возвышается мощный Белый Маяк из цельного камня. </w:t>
-        <w:br/>
-        <w:t xml:space="preserve">Он выдержит любой шторм и любой ветер. </w:t>
-        <w:br/>
-        <w:t xml:space="preserve">Он соединяет в себе четыре стихии: </w:t>
-        <w:br/>
-        <w:t xml:space="preserve">Землю — твой телесный покой и твердую опору. </w:t>
-        <w:br/>
-        <w:t xml:space="preserve">Воду — твои чистые, глубокие границы. </w:t>
-        <w:br/>
-        <w:t xml:space="preserve">Воздух — ясность и прозрачность без иллюзий. </w:t>
-        <w:br/>
-        <w:t xml:space="preserve">И Огонь — твое священное право быть собой и любить. </w:t>
-        <w:br/>
-        <w:t>Эти четыре стихии соединяются в единый сияющий луч: Свет Моего. [Пауза 7 сек]</w:t>
-        <w:br/>
-        <w:br/>
-        <w:t>[Нитка В: Ядро транса — Сад личного мира и Закон Маяка]</w:t>
-        <w:br/>
-        <w:t xml:space="preserve">И этот свет озаряет твой цветущий Сад. </w:t>
-        <w:br/>
-        <w:t xml:space="preserve">Это пространство твоей жизни. Твой личный мир, где ты — единственный, мудрый и заботливый хозяин. </w:t>
-        <w:br/>
-        <w:t>Ты сама сажаешь здесь цветы, прокладываешь каменные дорожки и создаешь свои правила. [Пауза 5 сек]</w:t>
-        <w:br/>
-        <w:br/>
-        <w:t xml:space="preserve">А иногда за воротами сада может шуметь ветер. </w:t>
-        <w:br/>
-        <w:t xml:space="preserve">А на дороге снаружи кто-то может внезапно замолчать, сбавить шаг или отвернуться. </w:t>
-        <w:br/>
-        <w:t xml:space="preserve">И в этот самый момент, когда снаружи кто-то затихает или уходит в молчание... </w:t>
-        <w:br/>
-        <w:t xml:space="preserve">Твое тело не сжимается в привычную тревогу. </w:t>
-        <w:br/>
-        <w:t xml:space="preserve">Оно помнит: Маяк не бегает по морю за кораблями. </w:t>
-        <w:br/>
-        <w:t>Так и ты не выбегаешь в панике за ворота своего сада. [Пауза 7 сек]</w:t>
-        <w:br/>
-        <w:br/>
-        <w:t xml:space="preserve">Шея и плечи сохраняют полное расслабление. </w:t>
-        <w:br/>
-        <w:t xml:space="preserve">Нижняя челюсть остается мягкой. </w:t>
-        <w:br/>
-        <w:t>А дыхание автоматически выбирает длинный, плавный выдох. [Пауза 4 сек]</w:t>
-        <w:br/>
-        <w:t xml:space="preserve">Ты не догоняешь тех, кто сбавил шаг. </w:t>
-        <w:br/>
-        <w:t xml:space="preserve">Ты не спасаешь тех, кто выбрал молчание. </w:t>
-        <w:br/>
-        <w:t xml:space="preserve">Ты просто сохраняешь выдох, сохраняешь ровный шаг и спокойно наблюдаешь за реальными поступками. </w:t>
-        <w:br/>
-        <w:t xml:space="preserve">Если за воротами искреннее тепло и уважение — ты открываешь калитку. </w:t>
-        <w:br/>
-        <w:t xml:space="preserve">А если холод и сомнения — делаешь спокойный выдох, разворачиваешься к своим солнечным аллеям и продолжаешь обустраивать свою красивую жизнь. </w:t>
-        <w:br/>
-        <w:t>Твое время и твой покой — твоя высшая ценность. [Пауза 7 сек]</w:t>
-        <w:br/>
-        <w:br/>
-        <w:t>[Закрытие Б2 &amp; А2: Интеграция правила достоинства]</w:t>
-        <w:br/>
-        <w:t xml:space="preserve">И в твоем сердце навсегда закрепляется главное правило: </w:t>
-        <w:br/>
-        <w:t>«Я выбираю только те отношения, где мне легко, спокойно и уважительно». [Пауза 5 сек]</w:t>
-        <w:br/>
-        <w:t xml:space="preserve">Спина становится ровной, в груди расцветает тихое достоинство и свобода. </w:t>
-        <w:br/>
-        <w:t>Ты в полной безопасности и на своей стороне. [Пауза 5 сек]</w:t>
+        <w:t>[Музыкальное вступление: минималистичный, гармоничный звук поющей чаши и бамбука 528 Гц — Пауза 6 сек]</w:t>
+        <w:br/>
+        <w:br/>
+        <w:t>Здравствуй. [Пауза 3 сек]</w:t>
+        <w:br/>
+        <w:t xml:space="preserve">Устройся спокойно. </w:t>
+        <w:br/>
+        <w:t xml:space="preserve">Перед тем как начать свой день или когда ты чувствуешь, что кто-то пытается раскачать твой покой... </w:t>
+        <w:br/>
+        <w:t>Мы выполним простую настройку на чистую невовлеченность. [Пауза 4 сек]</w:t>
+        <w:br/>
+        <w:br/>
+        <w:t>Сделай свободный вдох через нос... [Пауза 3 сек]</w:t>
+        <w:br/>
+        <w:t>И плавный, беззвучный выдох, словно сдуваешь пушинку с ладони. [Пауза 4 сек]</w:t>
+        <w:br/>
+        <w:t xml:space="preserve">Обрати внимание на то, как расслабляются виски и уголки губ. </w:t>
+        <w:br/>
+        <w:t xml:space="preserve">На лице появляется легкое, едва заметное выражение нейтральности. </w:t>
+        <w:br/>
+        <w:t>Ты ни с кем не споришь. Ты никого не судишь. Ты просто наблюдаешь. [Пауза 5 сек]</w:t>
+        <w:br/>
+        <w:br/>
+        <w:t>[Нитка А1: Японский сад камней и бамбуковый источник]</w:t>
+        <w:br/>
+        <w:t xml:space="preserve">Представь уединенный сад камней в лучах утреннего солнца. </w:t>
+        <w:br/>
+        <w:t xml:space="preserve">Здесь идеальный белый песок, расчесанный плавными круговыми линиями граблей. </w:t>
+        <w:br/>
+        <w:t xml:space="preserve">Посреди песка лежат гладкие, темные речные валуны. </w:t>
+        <w:br/>
+        <w:t xml:space="preserve">Они неподвижны, согреты солнцем и совершенны в своей простоте. </w:t>
+        <w:br/>
+        <w:t xml:space="preserve">Рядом неспешно течет тонкая струйка воды из бамбукового желоба: кап... кап... </w:t>
+        <w:br/>
+        <w:t>Каждый щелчок бамбука возвращает тебя в настоящий момент. [Пауза 6 сек]</w:t>
+        <w:br/>
+        <w:br/>
+        <w:t>[Нитка Б1: Осанка гладкого валуна]</w:t>
+        <w:br/>
+        <w:t xml:space="preserve">Почувствуй себя одним из этих валунов в саду. </w:t>
+        <w:br/>
+        <w:t xml:space="preserve">Твое тело устойчиво, плотно и монолитно. </w:t>
+        <w:br/>
+        <w:t xml:space="preserve">По нему может скользить солнечный луч, может падать осенний лист или моросить дождь. </w:t>
+        <w:br/>
+        <w:t xml:space="preserve">Но сам камень остается недвижим. </w:t>
+        <w:br/>
+        <w:t xml:space="preserve">Он не реагирует на шум ветра, не подпрыгивает от падения листа и не меняет своей формы. </w:t>
+        <w:br/>
+        <w:t>Ты сохраняешь внутреннее достоинство и покой перед любыми внешними колебаниями. [Пауза 7 сек]</w:t>
+        <w:br/>
+        <w:br/>
+        <w:t>[Нитка В: Ядро транса — Закон автономии: чужое движение — это не твой приказ]</w:t>
+        <w:br/>
+        <w:t xml:space="preserve">Если кто-то рядом повышает голос, отдаляется, устраивает драму или замолкает... </w:t>
+        <w:br/>
+        <w:t xml:space="preserve">Ты не втягиваешься в этот танец. </w:t>
+        <w:br/>
+        <w:t xml:space="preserve">Ты остаешься согретым солнцем гладким камнем. </w:t>
+        <w:br/>
+        <w:t xml:space="preserve">Ты делаешь спокойный выдох и мысленно говоришь: </w:t>
+        <w:br/>
+        <w:t xml:space="preserve">«Это твоя волна, а это мой берег. Я не обязана разрушать себя ради чужого шторма». </w:t>
+        <w:br/>
+        <w:t>Твое состояние — под твоим полным контролем. [Пауза 7 сек]</w:t>
+        <w:br/>
+        <w:br/>
+        <w:t>[Закрытие Б2 &amp; А2: Тепло и тишина]</w:t>
+        <w:br/>
+        <w:t xml:space="preserve">Тепло камня согревает грудь и поясницу. </w:t>
+        <w:br/>
+        <w:t xml:space="preserve">Дыхание ровное, как гладь песка. </w:t>
+        <w:br/>
+        <w:t>В саду звенит прозрачная утренняя тишина. [Пауза 5 сек]</w:t>
         <w:br/>
         <w:br/>
         <w:t>[Выход]</w:t>
         <w:br/>
-        <w:t>Сделай глубокий вдох и длинный освежающий выдох. [Пауза 3 сек]</w:t>
-        <w:br/>
-        <w:t xml:space="preserve">Потянись сладко всем телом. </w:t>
-        <w:br/>
-        <w:t>Открывай глаза хозяйкой своего мира. Ты молодец. [Музыкальное завершение — Пауза 6 сек]</w:t>
+        <w:t xml:space="preserve">Сделай глубокий вдох... мягкий выдох. </w:t>
+        <w:br/>
+        <w:t>Потянись телом. Открывай глаза со спокойной улыбкой наблюдателя. [Музыкальное завершение — Пауза 6 сек]</w:t>
       </w:r>
     </w:p>
     <w:sectPr>

</xml_diff>